<commit_message>
Modified review of literature
</commit_message>
<xml_diff>
--- a/docs/literature/CapstoneResearch_26-05-2026.docx
+++ b/docs/literature/CapstoneResearch_26-05-2026.docx
@@ -1170,25 +1170,7 @@
           <w:szCs w:val="24"/>
           <w:shd w:val="clear" w:color="auto" w:fill="FFFFFF"/>
         </w:rPr>
-        <w:t xml:space="preserve">significantly disrupt fish </w:t>
-      </w:r>
-      <w:r>
-        <w:rPr>
-          <w:rFonts w:ascii="Times New Roman" w:hAnsi="Times New Roman" w:cs="Times New Roman"/>
-          <w:sz w:val="24"/>
-          <w:szCs w:val="24"/>
-          <w:shd w:val="clear" w:color="auto" w:fill="FFFFFF"/>
-        </w:rPr>
-        <w:t>behaviour</w:t>
-      </w:r>
-      <w:r>
-        <w:rPr>
-          <w:rFonts w:ascii="Times New Roman" w:hAnsi="Times New Roman" w:cs="Times New Roman"/>
-          <w:sz w:val="24"/>
-          <w:szCs w:val="24"/>
-          <w:shd w:val="clear" w:color="auto" w:fill="FFFFFF"/>
-        </w:rPr>
-        <w:t xml:space="preserve">, weaken immune responses, impair metabolic </w:t>
+        <w:t xml:space="preserve">significantly disrupt fish behaviour, weaken immune responses, impair metabolic </w:t>
       </w:r>
       <w:r>
         <w:rPr>
@@ -1941,23 +1923,7 @@
           <w:rFonts w:ascii="Times New Roman" w:hAnsi="Times New Roman" w:cs="Times New Roman"/>
           <w:sz w:val="24"/>
         </w:rPr>
-        <w:t>(</w:t>
-      </w:r>
-      <w:proofErr w:type="spellStart"/>
-      <w:r>
-        <w:rPr>
-          <w:rFonts w:ascii="Times New Roman" w:hAnsi="Times New Roman" w:cs="Times New Roman"/>
-          <w:sz w:val="24"/>
-        </w:rPr>
-        <w:t>Rastegari</w:t>
-      </w:r>
-      <w:proofErr w:type="spellEnd"/>
-      <w:r>
-        <w:rPr>
-          <w:rFonts w:ascii="Times New Roman" w:hAnsi="Times New Roman" w:cs="Times New Roman"/>
-          <w:sz w:val="24"/>
-        </w:rPr>
-        <w:t xml:space="preserve"> </w:t>
+        <w:t xml:space="preserve">(Rastegari </w:t>
       </w:r>
       <w:r>
         <w:rPr>
@@ -2284,7 +2250,7 @@
           <w:szCs w:val="24"/>
           <w:shd w:val="clear" w:color="auto" w:fill="FFFFFF"/>
         </w:rPr>
-        <w:t>Fresh Water vs Marine Systems</w:t>
+        <w:t>Nitrate(ppm)</w:t>
       </w:r>
     </w:p>
     <w:p>
@@ -2308,7 +2274,7 @@
           <w:szCs w:val="24"/>
           <w:shd w:val="clear" w:color="auto" w:fill="FFFFFF"/>
         </w:rPr>
-        <w:t>Seasonal Dynamics</w:t>
+        <w:t>Fresh Water vs Marine Systems</w:t>
       </w:r>
     </w:p>
     <w:p>
@@ -2332,186 +2298,7 @@
           <w:szCs w:val="24"/>
           <w:shd w:val="clear" w:color="auto" w:fill="FFFFFF"/>
         </w:rPr>
-        <w:t>Interaction between Parameters</w:t>
-      </w:r>
-    </w:p>
-    <w:p>
-      <w:pPr>
-        <w:spacing w:after="0" w:line="480" w:lineRule="auto"/>
-        <w:rPr>
-          <w:rFonts w:ascii="Times New Roman" w:hAnsi="Times New Roman" w:cs="Times New Roman"/>
-          <w:sz w:val="24"/>
-          <w:szCs w:val="24"/>
-          <w:shd w:val="clear" w:color="auto" w:fill="FFFFFF"/>
-        </w:rPr>
-      </w:pPr>
-      <w:r>
-        <w:rPr>
-          <w:rFonts w:ascii="Times New Roman" w:hAnsi="Times New Roman" w:cs="Times New Roman"/>
-          <w:sz w:val="24"/>
-          <w:szCs w:val="24"/>
-          <w:shd w:val="clear" w:color="auto" w:fill="FFFFFF"/>
-        </w:rPr>
-        <w:t>Temperature is a fundamental environmental factor that indirectly drives dissolved oxygen (DO) dynamics by exerting a dual influence. It inversely affects oxygen solubility, as colder water retains higher levels of dissolved oxygen, while also reducing the metabolic rates of aquatic organisms, thereby lowering oxygen demand</w:t>
-      </w:r>
-      <w:r>
-        <w:rPr>
-          <w:rFonts w:ascii="Times New Roman" w:hAnsi="Times New Roman" w:cs="Times New Roman"/>
-          <w:sz w:val="24"/>
-          <w:szCs w:val="24"/>
-          <w:shd w:val="clear" w:color="auto" w:fill="FFFFFF"/>
-        </w:rPr>
-        <w:t xml:space="preserve"> </w:t>
-      </w:r>
-      <w:r>
-        <w:rPr>
-          <w:rFonts w:ascii="Times New Roman" w:hAnsi="Times New Roman" w:cs="Times New Roman"/>
-          <w:sz w:val="24"/>
-          <w:szCs w:val="24"/>
-          <w:shd w:val="clear" w:color="auto" w:fill="FFFFFF"/>
-        </w:rPr>
-        <w:fldChar w:fldCharType="begin"/>
-      </w:r>
-      <w:r>
-        <w:rPr>
-          <w:rFonts w:ascii="Times New Roman" w:hAnsi="Times New Roman" w:cs="Times New Roman"/>
-          <w:sz w:val="24"/>
-          <w:szCs w:val="24"/>
-          <w:shd w:val="clear" w:color="auto" w:fill="FFFFFF"/>
-        </w:rPr>
-        <w:instrText xml:space="preserve"> ADDIN ZOTERO_ITEM CSL_CITATION {"citationID":"DcYHSPdG","properties":{"unsorted":false,"formattedCitation":"(Ali et al., 2022)","plainCitation":"(Ali et al., 2022)","noteIndex":0},"citationItems":[{"id":754,"uris":["http://zotero.org/users/8571048/items/KBERSCQI"],"itemData":{"id":754,"type":"article-journal","abstract":"Dissolved Oxygen (DO) is one of the most important factors for aquatic animals as especially for those who derive dissolved oxygen from the water. DO levels indicate the quality of water. Many biotic and abiotic factors may influence DO concentration like mixing of different water bodies, upwelling, atmospheric exchange, respiration, photosynthesis, ice cover, pollution and some physical factors like salinity and temperature. The fluctuations in DO levels in water affect fish physiology. In this review, we will focus on the impact of DO on freshwater fish-physiology. A detailed literature survey is given based on DO and freshwater fish swimming, feeding, disease management, survival, respiration, metabolism, growth, reproduction, health parameters, immunity and stress of freshwater fishes.","container-title":"International Journal of Fisheries and Aquatic Studies","DOI":"10.22271/fish.2022.v10.i4b.2693","ISSN":"2347-5129","issue":"4","journalAbbreviation":"Int. J. Fish. Aquat. Stud.","language":"en","page":"113-127","publisher":"AkiNik Publications","source":"www.fisheriesjournal.com","title":"Effects of dissolved oxygen concentration on freshwater fish: A review","title-short":"Effects of dissolved oxygen concentration on freshwater fish","URL":"https://www.fisheriesjournal.com/archives/?year=2022&amp;vol=10&amp;issue=4&amp;part=B&amp;ArticleId=2693","volume":"10","author":[{"family":"Ali","given":"Bulbul"},{"family":"Anushka","given":""},{"family":"Mishra","given":"Abha"}],"accessed":{"date-parts":[["2026",5,31]]},"issued":{"date-parts":[["2022"]]}}}],"schema":"https://github.com/citation-style-language/schema/raw/master/csl-citation.json"} </w:instrText>
-      </w:r>
-      <w:r>
-        <w:rPr>
-          <w:rFonts w:ascii="Times New Roman" w:hAnsi="Times New Roman" w:cs="Times New Roman"/>
-          <w:sz w:val="24"/>
-          <w:szCs w:val="24"/>
-          <w:shd w:val="clear" w:color="auto" w:fill="FFFFFF"/>
-        </w:rPr>
-        <w:fldChar w:fldCharType="separate"/>
-      </w:r>
-      <w:r>
-        <w:rPr>
-          <w:rFonts w:ascii="Times New Roman" w:hAnsi="Times New Roman" w:cs="Times New Roman"/>
-          <w:sz w:val="24"/>
-        </w:rPr>
-        <w:t xml:space="preserve">(Ali </w:t>
-      </w:r>
-      <w:r>
-        <w:rPr>
-          <w:rFonts w:ascii="Times New Roman" w:hAnsi="Times New Roman" w:cs="Times New Roman"/>
-          <w:i/>
-          <w:iCs/>
-          <w:sz w:val="24"/>
-        </w:rPr>
-        <w:t>et al.,</w:t>
-      </w:r>
-      <w:r>
-        <w:rPr>
-          <w:rFonts w:ascii="Times New Roman" w:hAnsi="Times New Roman" w:cs="Times New Roman"/>
-          <w:sz w:val="24"/>
-        </w:rPr>
-        <w:t xml:space="preserve"> 2022)</w:t>
-      </w:r>
-      <w:r>
-        <w:rPr>
-          <w:rFonts w:ascii="Times New Roman" w:hAnsi="Times New Roman" w:cs="Times New Roman"/>
-          <w:sz w:val="24"/>
-          <w:szCs w:val="24"/>
-          <w:shd w:val="clear" w:color="auto" w:fill="FFFFFF"/>
-        </w:rPr>
-        <w:fldChar w:fldCharType="end"/>
-      </w:r>
-      <w:r>
-        <w:rPr>
-          <w:rFonts w:ascii="Times New Roman" w:hAnsi="Times New Roman" w:cs="Times New Roman"/>
-          <w:sz w:val="24"/>
-          <w:szCs w:val="24"/>
-          <w:shd w:val="clear" w:color="auto" w:fill="FFFFFF"/>
-        </w:rPr>
-        <w:t xml:space="preserve"> </w:t>
-      </w:r>
-      <w:r>
-        <w:rPr>
-          <w:rFonts w:ascii="Times New Roman" w:hAnsi="Times New Roman" w:cs="Times New Roman"/>
-          <w:sz w:val="24"/>
-          <w:szCs w:val="24"/>
-          <w:shd w:val="clear" w:color="auto" w:fill="FFFFFF"/>
-        </w:rPr>
-        <w:t>.</w:t>
-      </w:r>
-      <w:r>
-        <w:t xml:space="preserve"> </w:t>
-      </w:r>
-      <w:r>
-        <w:rPr>
-          <w:rFonts w:ascii="Times New Roman" w:hAnsi="Times New Roman" w:cs="Times New Roman"/>
-          <w:sz w:val="24"/>
-          <w:szCs w:val="24"/>
-          <w:shd w:val="clear" w:color="auto" w:fill="FFFFFF"/>
-        </w:rPr>
-        <w:t>In addition, temperature influences internal oxygen transport in aquatic organisms, with higher temperatures promoting improved circulation and oxygen distribution, whereas lower temperatures reduce circulatory performance and metabolic rates</w:t>
-      </w:r>
-      <w:r>
-        <w:rPr>
-          <w:rFonts w:ascii="Times New Roman" w:hAnsi="Times New Roman" w:cs="Times New Roman"/>
-          <w:sz w:val="24"/>
-          <w:szCs w:val="24"/>
-          <w:shd w:val="clear" w:color="auto" w:fill="FFFFFF"/>
-        </w:rPr>
-        <w:t xml:space="preserve"> </w:t>
-      </w:r>
-      <w:r>
-        <w:rPr>
-          <w:rFonts w:ascii="Times New Roman" w:hAnsi="Times New Roman" w:cs="Times New Roman"/>
-          <w:sz w:val="24"/>
-          <w:szCs w:val="24"/>
-          <w:shd w:val="clear" w:color="auto" w:fill="FFFFFF"/>
-        </w:rPr>
-        <w:fldChar w:fldCharType="begin"/>
-      </w:r>
-      <w:r>
-        <w:rPr>
-          <w:rFonts w:ascii="Times New Roman" w:hAnsi="Times New Roman" w:cs="Times New Roman"/>
-          <w:sz w:val="24"/>
-          <w:szCs w:val="24"/>
-          <w:shd w:val="clear" w:color="auto" w:fill="FFFFFF"/>
-        </w:rPr>
-        <w:instrText xml:space="preserve"> ADDIN ZOTERO_ITEM CSL_CITATION {"citationID":"cbkApQE5","properties":{"unsorted":false,"formattedCitation":"(Farrell, 2002)","plainCitation":"(Farrell, 2002)","noteIndex":0},"citationItems":[{"id":758,"uris":["http://zotero.org/users/8571048/items/C9SFL3FZ"],"itemData":{"id":758,"type":"article-journal","abstract":"Studies in the laboratory with salmonids and now in the field with wild salmon clearly show that critical swimming performance has an optimum temperature. This temperature optimum is coincident with maximum aerobic scope and maximum cardiac scope. At a temperature that is higher than this optimum, however, whole animal performance declines abruptly. Evidence is presented here to suggest that this is directly associated with a decline in cardiac scope which limits oxygen supply to tissues. It is further suggested that the decline in maximum cardiac performance could reflect problems with the heart's own oxygen supply. The reasoning behind this suggestion is that, at temperatures at or below the optimum and probably because of a limitation on oxygen diffusion in skeletal muscle during exercise, venous oxygen does not fall below a threshold level during exercise, and so the heart receives just enough oxygen for its own muscular activity via the cardiac circulation (i.e. the venous return to the heart). However, because high temperature favours increased oxygen extraction by skeletal muscle, which consequently lowers venous oxygen, cardiac oxygen supply may become insufficient to meet cardiac oxygen demand. The hypoxic myocardium then cannot maintain cardiac scope and internal oxygen delivery to tissue declines.","container-title":"Comparative Biochemistry and Physiology Part A: Molecular &amp; Integrative Physiology","DOI":"10.1016/S1095-6433(02)00049-1","ISSN":"1095-6433","issue":"4","journalAbbreviation":"Comparative Biochemistry and Physiology Part A: Molecular &amp; Integrative Physiology","page":"797-810","source":"ScienceDirect","title":"Cardiorespiratory performance in salmonids during exercise at high temperature: insights into cardiovascular design limitations in fishes","title-short":"Cardiorespiratory performance in salmonids during exercise at high temperature","URL":"https://www.sciencedirect.com/science/article/pii/S1095643302000491","volume":"132","author":[{"family":"Farrell","given":"A. P"}],"accessed":{"date-parts":[["2026",5,31]]},"issued":{"date-parts":[["2002",8,1]]}}}],"schema":"https://github.com/citation-style-language/schema/raw/master/csl-citation.json"} </w:instrText>
-      </w:r>
-      <w:r>
-        <w:rPr>
-          <w:rFonts w:ascii="Times New Roman" w:hAnsi="Times New Roman" w:cs="Times New Roman"/>
-          <w:sz w:val="24"/>
-          <w:szCs w:val="24"/>
-          <w:shd w:val="clear" w:color="auto" w:fill="FFFFFF"/>
-        </w:rPr>
-        <w:fldChar w:fldCharType="separate"/>
-      </w:r>
-      <w:r>
-        <w:rPr>
-          <w:rFonts w:ascii="Times New Roman" w:hAnsi="Times New Roman" w:cs="Times New Roman"/>
-          <w:sz w:val="24"/>
-        </w:rPr>
-        <w:t>(Farrell, 2002)</w:t>
-      </w:r>
-      <w:r>
-        <w:rPr>
-          <w:rFonts w:ascii="Times New Roman" w:hAnsi="Times New Roman" w:cs="Times New Roman"/>
-          <w:sz w:val="24"/>
-          <w:szCs w:val="24"/>
-          <w:shd w:val="clear" w:color="auto" w:fill="FFFFFF"/>
-        </w:rPr>
-        <w:fldChar w:fldCharType="end"/>
-      </w:r>
-      <w:r>
-        <w:rPr>
-          <w:rFonts w:ascii="Times New Roman" w:hAnsi="Times New Roman" w:cs="Times New Roman"/>
-          <w:sz w:val="24"/>
-          <w:szCs w:val="24"/>
-          <w:shd w:val="clear" w:color="auto" w:fill="FFFFFF"/>
-        </w:rPr>
-        <w:t>.</w:t>
+        <w:t>Seasonal Dynamics</w:t>
       </w:r>
     </w:p>
     <w:p>
@@ -2535,72 +2322,77 @@
           <w:szCs w:val="24"/>
           <w:shd w:val="clear" w:color="auto" w:fill="FFFFFF"/>
         </w:rPr>
-        <w:t>Traditional Monitoring Methods</w:t>
-      </w:r>
-    </w:p>
-    <w:p>
-      <w:pPr>
-        <w:spacing w:after="0" w:line="480" w:lineRule="auto"/>
-        <w:rPr>
-          <w:rFonts w:ascii="Times New Roman" w:hAnsi="Times New Roman" w:cs="Times New Roman"/>
-          <w:sz w:val="24"/>
-          <w:szCs w:val="24"/>
-          <w:shd w:val="clear" w:color="auto" w:fill="FFFFFF"/>
-        </w:rPr>
-      </w:pPr>
-      <w:r>
-        <w:rPr>
-          <w:rFonts w:ascii="Times New Roman" w:hAnsi="Times New Roman" w:cs="Times New Roman"/>
-          <w:sz w:val="24"/>
-          <w:szCs w:val="24"/>
-          <w:shd w:val="clear" w:color="auto" w:fill="FFFFFF"/>
-        </w:rPr>
-        <w:t xml:space="preserve">Traditional methods of </w:t>
-      </w:r>
-      <w:r>
-        <w:rPr>
-          <w:rFonts w:ascii="Times New Roman" w:hAnsi="Times New Roman" w:cs="Times New Roman"/>
-          <w:sz w:val="24"/>
-          <w:szCs w:val="24"/>
-          <w:shd w:val="clear" w:color="auto" w:fill="FFFFFF"/>
-        </w:rPr>
-        <w:t xml:space="preserve">water quality monitoring </w:t>
-      </w:r>
-      <w:r>
-        <w:rPr>
-          <w:rFonts w:ascii="Times New Roman" w:hAnsi="Times New Roman" w:cs="Times New Roman"/>
-          <w:sz w:val="24"/>
-          <w:szCs w:val="24"/>
-          <w:shd w:val="clear" w:color="auto" w:fill="FFFFFF"/>
-        </w:rPr>
-        <w:t>are</w:t>
-      </w:r>
-      <w:r>
-        <w:rPr>
-          <w:rFonts w:ascii="Times New Roman" w:hAnsi="Times New Roman" w:cs="Times New Roman"/>
-          <w:sz w:val="24"/>
-          <w:szCs w:val="24"/>
-          <w:shd w:val="clear" w:color="auto" w:fill="FFFFFF"/>
-        </w:rPr>
-        <w:t xml:space="preserve"> mainly conducted using sample-based laboratory testing, in-situ sensor detection, and satellite-based remote sensing techniques. Although conventional sampling methods provide highly detailed information on water quality parameters, their high operational cost limits their suitability for real-time monitoring. In addition, they are often unable to adequately capture the spatial variability and heterogeneity of aquatic environments</w:t>
-      </w:r>
-      <w:r>
-        <w:rPr>
-          <w:rFonts w:ascii="Times New Roman" w:hAnsi="Times New Roman" w:cs="Times New Roman"/>
-          <w:sz w:val="24"/>
-          <w:szCs w:val="24"/>
-          <w:shd w:val="clear" w:color="auto" w:fill="FFFFFF"/>
-        </w:rPr>
-        <w:t xml:space="preserve"> (Sun </w:t>
-      </w:r>
-      <w:r>
-        <w:rPr>
-          <w:rFonts w:ascii="Times New Roman" w:hAnsi="Times New Roman" w:cs="Times New Roman"/>
-          <w:i/>
-          <w:iCs/>
-          <w:sz w:val="24"/>
-          <w:szCs w:val="24"/>
-          <w:shd w:val="clear" w:color="auto" w:fill="FFFFFF"/>
+        <w:t>Interaction between Parameters</w:t>
+      </w:r>
+    </w:p>
+    <w:p>
+      <w:pPr>
+        <w:spacing w:after="0" w:line="480" w:lineRule="auto"/>
+        <w:rPr>
+          <w:rFonts w:ascii="Times New Roman" w:hAnsi="Times New Roman" w:cs="Times New Roman"/>
+          <w:sz w:val="24"/>
+          <w:szCs w:val="24"/>
+          <w:shd w:val="clear" w:color="auto" w:fill="FFFFFF"/>
+        </w:rPr>
+      </w:pPr>
+      <w:r>
+        <w:rPr>
+          <w:rFonts w:ascii="Times New Roman" w:hAnsi="Times New Roman" w:cs="Times New Roman"/>
+          <w:sz w:val="24"/>
+          <w:szCs w:val="24"/>
+          <w:shd w:val="clear" w:color="auto" w:fill="FFFFFF"/>
+        </w:rPr>
+        <w:t>Temperature is a fundamental environmental factor that indirectly drives dissolved oxygen (DO) dynamics by exerting a dual influence. It inversely affects oxygen solubility, as colder water retains higher levels of dissolved oxygen, while also reducing the metabolic rates of aquatic organisms, thereby lowering oxygen demand</w:t>
+      </w:r>
+      <w:r>
+        <w:rPr>
+          <w:rFonts w:ascii="Times New Roman" w:hAnsi="Times New Roman" w:cs="Times New Roman"/>
+          <w:sz w:val="24"/>
+          <w:szCs w:val="24"/>
+          <w:shd w:val="clear" w:color="auto" w:fill="FFFFFF"/>
+        </w:rPr>
+        <w:t xml:space="preserve"> </w:t>
+      </w:r>
+      <w:r>
+        <w:rPr>
+          <w:rFonts w:ascii="Times New Roman" w:hAnsi="Times New Roman" w:cs="Times New Roman"/>
+          <w:sz w:val="24"/>
+          <w:szCs w:val="24"/>
+          <w:shd w:val="clear" w:color="auto" w:fill="FFFFFF"/>
+        </w:rPr>
+        <w:fldChar w:fldCharType="begin"/>
+      </w:r>
+      <w:r>
+        <w:rPr>
+          <w:rFonts w:ascii="Times New Roman" w:hAnsi="Times New Roman" w:cs="Times New Roman"/>
+          <w:sz w:val="24"/>
+          <w:szCs w:val="24"/>
+          <w:shd w:val="clear" w:color="auto" w:fill="FFFFFF"/>
+        </w:rPr>
+        <w:instrText xml:space="preserve"> ADDIN ZOTERO_ITEM CSL_CITATION {"citationID":"DcYHSPdG","properties":{"unsorted":false,"formattedCitation":"(Ali et al., 2022)","plainCitation":"(Ali et al., 2022)","noteIndex":0},"citationItems":[{"id":754,"uris":["http://zotero.org/users/8571048/items/KBERSCQI"],"itemData":{"id":754,"type":"article-journal","abstract":"Dissolved Oxygen (DO) is one of the most important factors for aquatic animals as especially for those who derive dissolved oxygen from the water. DO levels indicate the quality of water. Many biotic and abiotic factors may influence DO concentration like mixing of different water bodies, upwelling, atmospheric exchange, respiration, photosynthesis, ice cover, pollution and some physical factors like salinity and temperature. The fluctuations in DO levels in water affect fish physiology. In this review, we will focus on the impact of DO on freshwater fish-physiology. A detailed literature survey is given based on DO and freshwater fish swimming, feeding, disease management, survival, respiration, metabolism, growth, reproduction, health parameters, immunity and stress of freshwater fishes.","container-title":"International Journal of Fisheries and Aquatic Studies","DOI":"10.22271/fish.2022.v10.i4b.2693","ISSN":"2347-5129","issue":"4","journalAbbreviation":"Int. J. Fish. Aquat. Stud.","language":"en","page":"113-127","publisher":"AkiNik Publications","source":"www.fisheriesjournal.com","title":"Effects of dissolved oxygen concentration on freshwater fish: A review","title-short":"Effects of dissolved oxygen concentration on freshwater fish","URL":"https://www.fisheriesjournal.com/archives/?year=2022&amp;vol=10&amp;issue=4&amp;part=B&amp;ArticleId=2693","volume":"10","author":[{"family":"Ali","given":"Bulbul"},{"family":"Anushka","given":""},{"family":"Mishra","given":"Abha"}],"accessed":{"date-parts":[["2026",5,31]]},"issued":{"date-parts":[["2022"]]}}}],"schema":"https://github.com/citation-style-language/schema/raw/master/csl-citation.json"} </w:instrText>
+      </w:r>
+      <w:r>
+        <w:rPr>
+          <w:rFonts w:ascii="Times New Roman" w:hAnsi="Times New Roman" w:cs="Times New Roman"/>
+          <w:sz w:val="24"/>
+          <w:szCs w:val="24"/>
+          <w:shd w:val="clear" w:color="auto" w:fill="FFFFFF"/>
+        </w:rPr>
+        <w:fldChar w:fldCharType="separate"/>
+      </w:r>
+      <w:r>
+        <w:rPr>
+          <w:rFonts w:ascii="Times New Roman" w:hAnsi="Times New Roman" w:cs="Times New Roman"/>
+          <w:sz w:val="24"/>
+        </w:rPr>
+        <w:t xml:space="preserve">(Ali </w:t>
+      </w:r>
+      <w:r>
+        <w:rPr>
+          <w:rFonts w:ascii="Times New Roman" w:hAnsi="Times New Roman" w:cs="Times New Roman"/>
+          <w:i/>
+          <w:iCs/>
+          <w:sz w:val="24"/>
         </w:rPr>
         <w:t>et al.,</w:t>
       </w:r>
@@ -2608,30 +2400,26 @@
         <w:rPr>
           <w:rFonts w:ascii="Times New Roman" w:hAnsi="Times New Roman" w:cs="Times New Roman"/>
           <w:sz w:val="24"/>
-          <w:szCs w:val="24"/>
-          <w:shd w:val="clear" w:color="auto" w:fill="FFFFFF"/>
-        </w:rPr>
-        <w:t xml:space="preserve">2021; Shi </w:t>
-      </w:r>
-      <w:r>
-        <w:rPr>
-          <w:rFonts w:ascii="Times New Roman" w:hAnsi="Times New Roman" w:cs="Times New Roman"/>
-          <w:i/>
-          <w:iCs/>
-          <w:sz w:val="24"/>
-          <w:szCs w:val="24"/>
-          <w:shd w:val="clear" w:color="auto" w:fill="FFFFFF"/>
-        </w:rPr>
-        <w:t>et al.,</w:t>
-      </w:r>
-      <w:r>
-        <w:rPr>
-          <w:rFonts w:ascii="Times New Roman" w:hAnsi="Times New Roman" w:cs="Times New Roman"/>
-          <w:sz w:val="24"/>
-          <w:szCs w:val="24"/>
-          <w:shd w:val="clear" w:color="auto" w:fill="FFFFFF"/>
-        </w:rPr>
-        <w:t xml:space="preserve"> 2023)</w:t>
+        </w:rPr>
+        <w:t xml:space="preserve"> 2022)</w:t>
+      </w:r>
+      <w:r>
+        <w:rPr>
+          <w:rFonts w:ascii="Times New Roman" w:hAnsi="Times New Roman" w:cs="Times New Roman"/>
+          <w:sz w:val="24"/>
+          <w:szCs w:val="24"/>
+          <w:shd w:val="clear" w:color="auto" w:fill="FFFFFF"/>
+        </w:rPr>
+        <w:fldChar w:fldCharType="end"/>
+      </w:r>
+      <w:r>
+        <w:rPr>
+          <w:rFonts w:ascii="Times New Roman" w:hAnsi="Times New Roman" w:cs="Times New Roman"/>
+          <w:sz w:val="24"/>
+          <w:szCs w:val="24"/>
+          <w:shd w:val="clear" w:color="auto" w:fill="FFFFFF"/>
+        </w:rPr>
+        <w:t xml:space="preserve"> </w:t>
       </w:r>
       <w:r>
         <w:rPr>
@@ -2643,97 +2431,68 @@
         <w:t>.</w:t>
       </w:r>
       <w:r>
-        <w:rPr>
-          <w:rFonts w:ascii="Times New Roman" w:hAnsi="Times New Roman" w:cs="Times New Roman"/>
-          <w:sz w:val="24"/>
-          <w:szCs w:val="24"/>
-          <w:shd w:val="clear" w:color="auto" w:fill="FFFFFF"/>
-        </w:rPr>
-        <w:t xml:space="preserve"> Although</w:t>
-      </w:r>
-      <w:r>
-        <w:rPr>
-          <w:rFonts w:ascii="Times New Roman" w:hAnsi="Times New Roman" w:cs="Times New Roman"/>
-          <w:sz w:val="24"/>
-          <w:szCs w:val="24"/>
-          <w:shd w:val="clear" w:color="auto" w:fill="FFFFFF"/>
-        </w:rPr>
-        <w:t xml:space="preserve"> sensor-based monitoring systems provide the </w:t>
-      </w:r>
-      <w:r>
-        <w:rPr>
-          <w:rFonts w:ascii="Times New Roman" w:hAnsi="Times New Roman" w:cs="Times New Roman"/>
-          <w:sz w:val="24"/>
-          <w:szCs w:val="24"/>
-          <w:shd w:val="clear" w:color="auto" w:fill="FFFFFF"/>
-        </w:rPr>
-        <w:t>advantage</w:t>
-      </w:r>
-      <w:r>
-        <w:rPr>
-          <w:rFonts w:ascii="Times New Roman" w:hAnsi="Times New Roman" w:cs="Times New Roman"/>
-          <w:sz w:val="24"/>
-          <w:szCs w:val="24"/>
-          <w:shd w:val="clear" w:color="auto" w:fill="FFFFFF"/>
-        </w:rPr>
-        <w:t xml:space="preserve"> of real-time data acquisition, their </w:t>
-      </w:r>
-      <w:r>
-        <w:rPr>
-          <w:rFonts w:ascii="Times New Roman" w:hAnsi="Times New Roman" w:cs="Times New Roman"/>
-          <w:sz w:val="24"/>
-          <w:szCs w:val="24"/>
-          <w:shd w:val="clear" w:color="auto" w:fill="FFFFFF"/>
-        </w:rPr>
-        <w:t>performance</w:t>
-      </w:r>
-      <w:r>
-        <w:rPr>
-          <w:rFonts w:ascii="Times New Roman" w:hAnsi="Times New Roman" w:cs="Times New Roman"/>
-          <w:sz w:val="24"/>
-          <w:szCs w:val="24"/>
-          <w:shd w:val="clear" w:color="auto" w:fill="FFFFFF"/>
-        </w:rPr>
-        <w:t xml:space="preserve"> is often affected by environmental conditions that reduce measurement </w:t>
-      </w:r>
-      <w:r>
-        <w:rPr>
-          <w:rFonts w:ascii="Times New Roman" w:hAnsi="Times New Roman" w:cs="Times New Roman"/>
-          <w:sz w:val="24"/>
-          <w:szCs w:val="24"/>
-          <w:shd w:val="clear" w:color="auto" w:fill="FFFFFF"/>
-        </w:rPr>
-        <w:lastRenderedPageBreak/>
-        <w:t>accuracy. Furthermore, limited sensor deployment due to financial constraints can restrict spatial coverage, thereby limiting the effectiveness of comprehensive water quality assessment</w:t>
-      </w:r>
-      <w:r>
-        <w:rPr>
-          <w:rFonts w:ascii="Times New Roman" w:hAnsi="Times New Roman" w:cs="Times New Roman"/>
-          <w:sz w:val="24"/>
-          <w:szCs w:val="24"/>
-          <w:shd w:val="clear" w:color="auto" w:fill="FFFFFF"/>
-        </w:rPr>
-        <w:t xml:space="preserve"> (Liu </w:t>
-      </w:r>
-      <w:r>
-        <w:rPr>
-          <w:rFonts w:ascii="Times New Roman" w:hAnsi="Times New Roman" w:cs="Times New Roman"/>
-          <w:i/>
-          <w:iCs/>
-          <w:sz w:val="24"/>
-          <w:szCs w:val="24"/>
-          <w:shd w:val="clear" w:color="auto" w:fill="FFFFFF"/>
-        </w:rPr>
-        <w:t>et al.,</w:t>
-      </w:r>
-      <w:r>
-        <w:rPr>
-          <w:rFonts w:ascii="Times New Roman" w:hAnsi="Times New Roman" w:cs="Times New Roman"/>
-          <w:sz w:val="24"/>
-          <w:szCs w:val="24"/>
-          <w:shd w:val="clear" w:color="auto" w:fill="FFFFFF"/>
-        </w:rPr>
-        <w:t xml:space="preserve"> 2024)</w:t>
+        <w:t xml:space="preserve"> </w:t>
+      </w:r>
+      <w:r>
+        <w:rPr>
+          <w:rFonts w:ascii="Times New Roman" w:hAnsi="Times New Roman" w:cs="Times New Roman"/>
+          <w:sz w:val="24"/>
+          <w:szCs w:val="24"/>
+          <w:shd w:val="clear" w:color="auto" w:fill="FFFFFF"/>
+        </w:rPr>
+        <w:t>In addition, temperature influences internal oxygen transport in aquatic organisms, with higher temperatures promoting improved circulation and oxygen distribution, whereas lower temperatures reduce circulatory performance and metabolic rates</w:t>
+      </w:r>
+      <w:r>
+        <w:rPr>
+          <w:rFonts w:ascii="Times New Roman" w:hAnsi="Times New Roman" w:cs="Times New Roman"/>
+          <w:sz w:val="24"/>
+          <w:szCs w:val="24"/>
+          <w:shd w:val="clear" w:color="auto" w:fill="FFFFFF"/>
+        </w:rPr>
+        <w:t xml:space="preserve"> </w:t>
+      </w:r>
+      <w:r>
+        <w:rPr>
+          <w:rFonts w:ascii="Times New Roman" w:hAnsi="Times New Roman" w:cs="Times New Roman"/>
+          <w:sz w:val="24"/>
+          <w:szCs w:val="24"/>
+          <w:shd w:val="clear" w:color="auto" w:fill="FFFFFF"/>
+        </w:rPr>
+        <w:fldChar w:fldCharType="begin"/>
+      </w:r>
+      <w:r>
+        <w:rPr>
+          <w:rFonts w:ascii="Times New Roman" w:hAnsi="Times New Roman" w:cs="Times New Roman"/>
+          <w:sz w:val="24"/>
+          <w:szCs w:val="24"/>
+          <w:shd w:val="clear" w:color="auto" w:fill="FFFFFF"/>
+        </w:rPr>
+        <w:instrText xml:space="preserve"> ADDIN ZOTERO_ITEM CSL_CITATION {"citationID":"cbkApQE5","properties":{"unsorted":false,"formattedCitation":"(Farrell, 2002)","plainCitation":"(Farrell, 2002)","noteIndex":0},"citationItems":[{"id":758,"uris":["http://zotero.org/users/8571048/items/C9SFL3FZ"],"itemData":{"id":758,"type":"article-journal","abstract":"Studies in the laboratory with salmonids and now in the field with wild salmon clearly show that critical swimming performance has an optimum temperature. This temperature optimum is coincident with maximum aerobic scope and maximum cardiac scope. At a temperature that is higher than this optimum, however, whole animal performance declines abruptly. Evidence is presented here to suggest that this is directly associated with a decline in cardiac scope which limits oxygen supply to tissues. It is further suggested that the decline in maximum cardiac performance could reflect problems with the heart's own oxygen supply. The reasoning behind this suggestion is that, at temperatures at or below the optimum and probably because of a limitation on oxygen diffusion in skeletal muscle during exercise, venous oxygen does not fall below a threshold level during exercise, and so the heart receives just enough oxygen for its own muscular activity via the cardiac circulation (i.e. the venous return to the heart). However, because high temperature favours increased oxygen extraction by skeletal muscle, which consequently lowers venous oxygen, cardiac oxygen supply may become insufficient to meet cardiac oxygen demand. The hypoxic myocardium then cannot maintain cardiac scope and internal oxygen delivery to tissue declines.","container-title":"Comparative Biochemistry and Physiology Part A: Molecular &amp; Integrative Physiology","DOI":"10.1016/S1095-6433(02)00049-1","ISSN":"1095-6433","issue":"4","journalAbbreviation":"Comparative Biochemistry and Physiology Part A: Molecular &amp; Integrative Physiology","page":"797-810","source":"ScienceDirect","title":"Cardiorespiratory performance in salmonids during exercise at high temperature: insights into cardiovascular design limitations in fishes","title-short":"Cardiorespiratory performance in salmonids during exercise at high temperature","URL":"https://www.sciencedirect.com/science/article/pii/S1095643302000491","volume":"132","author":[{"family":"Farrell","given":"A. P"}],"accessed":{"date-parts":[["2026",5,31]]},"issued":{"date-parts":[["2002",8,1]]}}}],"schema":"https://github.com/citation-style-language/schema/raw/master/csl-citation.json"} </w:instrText>
+      </w:r>
+      <w:r>
+        <w:rPr>
+          <w:rFonts w:ascii="Times New Roman" w:hAnsi="Times New Roman" w:cs="Times New Roman"/>
+          <w:sz w:val="24"/>
+          <w:szCs w:val="24"/>
+          <w:shd w:val="clear" w:color="auto" w:fill="FFFFFF"/>
+        </w:rPr>
+        <w:fldChar w:fldCharType="separate"/>
+      </w:r>
+      <w:r>
+        <w:rPr>
+          <w:rFonts w:ascii="Times New Roman" w:hAnsi="Times New Roman" w:cs="Times New Roman"/>
+          <w:sz w:val="24"/>
+        </w:rPr>
+        <w:t>(Farrell, 2002)</w:t>
+      </w:r>
+      <w:r>
+        <w:rPr>
+          <w:rFonts w:ascii="Times New Roman" w:hAnsi="Times New Roman" w:cs="Times New Roman"/>
+          <w:sz w:val="24"/>
+          <w:szCs w:val="24"/>
+          <w:shd w:val="clear" w:color="auto" w:fill="FFFFFF"/>
+        </w:rPr>
+        <w:fldChar w:fldCharType="end"/>
       </w:r>
       <w:r>
         <w:rPr>
@@ -2766,9 +2525,210 @@
           <w:szCs w:val="24"/>
           <w:shd w:val="clear" w:color="auto" w:fill="FFFFFF"/>
         </w:rPr>
-        <w:t>Artificial Intelligence (</w:t>
-      </w:r>
-      <w:r>
+        <w:t>Traditional Monitoring Methods</w:t>
+      </w:r>
+    </w:p>
+    <w:p>
+      <w:pPr>
+        <w:spacing w:after="0" w:line="480" w:lineRule="auto"/>
+        <w:rPr>
+          <w:rFonts w:ascii="Times New Roman" w:hAnsi="Times New Roman" w:cs="Times New Roman"/>
+          <w:sz w:val="24"/>
+          <w:szCs w:val="24"/>
+          <w:shd w:val="clear" w:color="auto" w:fill="FFFFFF"/>
+        </w:rPr>
+      </w:pPr>
+      <w:r>
+        <w:rPr>
+          <w:rFonts w:ascii="Times New Roman" w:hAnsi="Times New Roman" w:cs="Times New Roman"/>
+          <w:sz w:val="24"/>
+          <w:szCs w:val="24"/>
+          <w:shd w:val="clear" w:color="auto" w:fill="FFFFFF"/>
+        </w:rPr>
+        <w:t xml:space="preserve">Traditional methods of </w:t>
+      </w:r>
+      <w:r>
+        <w:rPr>
+          <w:rFonts w:ascii="Times New Roman" w:hAnsi="Times New Roman" w:cs="Times New Roman"/>
+          <w:sz w:val="24"/>
+          <w:szCs w:val="24"/>
+          <w:shd w:val="clear" w:color="auto" w:fill="FFFFFF"/>
+        </w:rPr>
+        <w:t xml:space="preserve">water quality monitoring </w:t>
+      </w:r>
+      <w:r>
+        <w:rPr>
+          <w:rFonts w:ascii="Times New Roman" w:hAnsi="Times New Roman" w:cs="Times New Roman"/>
+          <w:sz w:val="24"/>
+          <w:szCs w:val="24"/>
+          <w:shd w:val="clear" w:color="auto" w:fill="FFFFFF"/>
+        </w:rPr>
+        <w:t>are</w:t>
+      </w:r>
+      <w:r>
+        <w:rPr>
+          <w:rFonts w:ascii="Times New Roman" w:hAnsi="Times New Roman" w:cs="Times New Roman"/>
+          <w:sz w:val="24"/>
+          <w:szCs w:val="24"/>
+          <w:shd w:val="clear" w:color="auto" w:fill="FFFFFF"/>
+        </w:rPr>
+        <w:t xml:space="preserve"> mainly conducted using sample-based laboratory testing, in-situ sensor detection, and satellite-based remote sensing techniques. Although conventional sampling methods provide highly detailed information on water quality parameters, their high operational cost limits their suitability for real-time monitoring. In addition, they are often unable to adequately capture the spatial variability and heterogeneity of aquatic environments</w:t>
+      </w:r>
+      <w:r>
+        <w:rPr>
+          <w:rFonts w:ascii="Times New Roman" w:hAnsi="Times New Roman" w:cs="Times New Roman"/>
+          <w:sz w:val="24"/>
+          <w:szCs w:val="24"/>
+          <w:shd w:val="clear" w:color="auto" w:fill="FFFFFF"/>
+        </w:rPr>
+        <w:t xml:space="preserve"> (Sun </w:t>
+      </w:r>
+      <w:r>
+        <w:rPr>
+          <w:rFonts w:ascii="Times New Roman" w:hAnsi="Times New Roman" w:cs="Times New Roman"/>
+          <w:i/>
+          <w:iCs/>
+          <w:sz w:val="24"/>
+          <w:szCs w:val="24"/>
+          <w:shd w:val="clear" w:color="auto" w:fill="FFFFFF"/>
+        </w:rPr>
+        <w:t>et al.,</w:t>
+      </w:r>
+      <w:r>
+        <w:rPr>
+          <w:rFonts w:ascii="Times New Roman" w:hAnsi="Times New Roman" w:cs="Times New Roman"/>
+          <w:sz w:val="24"/>
+          <w:szCs w:val="24"/>
+          <w:shd w:val="clear" w:color="auto" w:fill="FFFFFF"/>
+        </w:rPr>
+        <w:t xml:space="preserve">2021; Shi </w:t>
+      </w:r>
+      <w:r>
+        <w:rPr>
+          <w:rFonts w:ascii="Times New Roman" w:hAnsi="Times New Roman" w:cs="Times New Roman"/>
+          <w:i/>
+          <w:iCs/>
+          <w:sz w:val="24"/>
+          <w:szCs w:val="24"/>
+          <w:shd w:val="clear" w:color="auto" w:fill="FFFFFF"/>
+        </w:rPr>
+        <w:t>et al.,</w:t>
+      </w:r>
+      <w:r>
+        <w:rPr>
+          <w:rFonts w:ascii="Times New Roman" w:hAnsi="Times New Roman" w:cs="Times New Roman"/>
+          <w:sz w:val="24"/>
+          <w:szCs w:val="24"/>
+          <w:shd w:val="clear" w:color="auto" w:fill="FFFFFF"/>
+        </w:rPr>
+        <w:t xml:space="preserve"> 2023)</w:t>
+      </w:r>
+      <w:r>
+        <w:rPr>
+          <w:rFonts w:ascii="Times New Roman" w:hAnsi="Times New Roman" w:cs="Times New Roman"/>
+          <w:sz w:val="24"/>
+          <w:szCs w:val="24"/>
+          <w:shd w:val="clear" w:color="auto" w:fill="FFFFFF"/>
+        </w:rPr>
+        <w:t>.</w:t>
+      </w:r>
+      <w:r>
+        <w:rPr>
+          <w:rFonts w:ascii="Times New Roman" w:hAnsi="Times New Roman" w:cs="Times New Roman"/>
+          <w:sz w:val="24"/>
+          <w:szCs w:val="24"/>
+          <w:shd w:val="clear" w:color="auto" w:fill="FFFFFF"/>
+        </w:rPr>
+        <w:t xml:space="preserve"> Although</w:t>
+      </w:r>
+      <w:r>
+        <w:rPr>
+          <w:rFonts w:ascii="Times New Roman" w:hAnsi="Times New Roman" w:cs="Times New Roman"/>
+          <w:sz w:val="24"/>
+          <w:szCs w:val="24"/>
+          <w:shd w:val="clear" w:color="auto" w:fill="FFFFFF"/>
+        </w:rPr>
+        <w:t xml:space="preserve"> sensor-based monitoring systems provide the </w:t>
+      </w:r>
+      <w:r>
+        <w:rPr>
+          <w:rFonts w:ascii="Times New Roman" w:hAnsi="Times New Roman" w:cs="Times New Roman"/>
+          <w:sz w:val="24"/>
+          <w:szCs w:val="24"/>
+          <w:shd w:val="clear" w:color="auto" w:fill="FFFFFF"/>
+        </w:rPr>
+        <w:t>advantage</w:t>
+      </w:r>
+      <w:r>
+        <w:rPr>
+          <w:rFonts w:ascii="Times New Roman" w:hAnsi="Times New Roman" w:cs="Times New Roman"/>
+          <w:sz w:val="24"/>
+          <w:szCs w:val="24"/>
+          <w:shd w:val="clear" w:color="auto" w:fill="FFFFFF"/>
+        </w:rPr>
+        <w:t xml:space="preserve"> of real-time data acquisition, their </w:t>
+      </w:r>
+      <w:r>
+        <w:rPr>
+          <w:rFonts w:ascii="Times New Roman" w:hAnsi="Times New Roman" w:cs="Times New Roman"/>
+          <w:sz w:val="24"/>
+          <w:szCs w:val="24"/>
+          <w:shd w:val="clear" w:color="auto" w:fill="FFFFFF"/>
+        </w:rPr>
+        <w:lastRenderedPageBreak/>
+        <w:t>performance</w:t>
+      </w:r>
+      <w:r>
+        <w:rPr>
+          <w:rFonts w:ascii="Times New Roman" w:hAnsi="Times New Roman" w:cs="Times New Roman"/>
+          <w:sz w:val="24"/>
+          <w:szCs w:val="24"/>
+          <w:shd w:val="clear" w:color="auto" w:fill="FFFFFF"/>
+        </w:rPr>
+        <w:t xml:space="preserve"> is often affected by environmental conditions that reduce measurement accuracy. Furthermore, limited sensor deployment due to financial constraints can restrict spatial coverage, thereby limiting the effectiveness of comprehensive water quality assessment</w:t>
+      </w:r>
+      <w:r>
+        <w:rPr>
+          <w:rFonts w:ascii="Times New Roman" w:hAnsi="Times New Roman" w:cs="Times New Roman"/>
+          <w:sz w:val="24"/>
+          <w:szCs w:val="24"/>
+          <w:shd w:val="clear" w:color="auto" w:fill="FFFFFF"/>
+        </w:rPr>
+        <w:t xml:space="preserve"> (Liu </w:t>
+      </w:r>
+      <w:r>
+        <w:rPr>
+          <w:rFonts w:ascii="Times New Roman" w:hAnsi="Times New Roman" w:cs="Times New Roman"/>
+          <w:i/>
+          <w:iCs/>
+          <w:sz w:val="24"/>
+          <w:szCs w:val="24"/>
+          <w:shd w:val="clear" w:color="auto" w:fill="FFFFFF"/>
+        </w:rPr>
+        <w:t>et al.,</w:t>
+      </w:r>
+      <w:r>
+        <w:rPr>
+          <w:rFonts w:ascii="Times New Roman" w:hAnsi="Times New Roman" w:cs="Times New Roman"/>
+          <w:sz w:val="24"/>
+          <w:szCs w:val="24"/>
+          <w:shd w:val="clear" w:color="auto" w:fill="FFFFFF"/>
+        </w:rPr>
+        <w:t xml:space="preserve"> 2024)</w:t>
+      </w:r>
+      <w:r>
+        <w:rPr>
+          <w:rFonts w:ascii="Times New Roman" w:hAnsi="Times New Roman" w:cs="Times New Roman"/>
+          <w:sz w:val="24"/>
+          <w:szCs w:val="24"/>
+          <w:shd w:val="clear" w:color="auto" w:fill="FFFFFF"/>
+        </w:rPr>
+        <w:t>.</w:t>
+      </w:r>
+    </w:p>
+    <w:p>
+      <w:pPr>
+        <w:spacing w:after="0" w:line="480" w:lineRule="auto"/>
         <w:rPr>
           <w:rFonts w:ascii="Times New Roman" w:hAnsi="Times New Roman" w:cs="Times New Roman"/>
           <w:b/>
@@ -2777,8 +2737,7 @@
           <w:szCs w:val="24"/>
           <w:shd w:val="clear" w:color="auto" w:fill="FFFFFF"/>
         </w:rPr>
-        <w:t>AI</w:t>
-      </w:r>
+      </w:pPr>
       <w:r>
         <w:rPr>
           <w:rFonts w:ascii="Times New Roman" w:hAnsi="Times New Roman" w:cs="Times New Roman"/>
@@ -2788,7 +2747,7 @@
           <w:szCs w:val="24"/>
           <w:shd w:val="clear" w:color="auto" w:fill="FFFFFF"/>
         </w:rPr>
-        <w:t>)</w:t>
+        <w:t>Artificial Intelligence (</w:t>
       </w:r>
       <w:r>
         <w:rPr>
@@ -2799,481 +2758,9 @@
           <w:szCs w:val="24"/>
           <w:shd w:val="clear" w:color="auto" w:fill="FFFFFF"/>
         </w:rPr>
-        <w:t xml:space="preserve"> Methods </w:t>
-      </w:r>
-    </w:p>
-    <w:p>
-      <w:pPr>
-        <w:spacing w:after="0" w:line="480" w:lineRule="auto"/>
-        <w:rPr>
-          <w:rFonts w:ascii="Times New Roman" w:hAnsi="Times New Roman" w:cs="Times New Roman"/>
-          <w:sz w:val="24"/>
-          <w:szCs w:val="24"/>
-          <w:shd w:val="clear" w:color="auto" w:fill="FFFFFF"/>
-        </w:rPr>
-      </w:pPr>
-      <w:r>
-        <w:rPr>
-          <w:rFonts w:ascii="Times New Roman" w:hAnsi="Times New Roman" w:cs="Times New Roman"/>
-          <w:sz w:val="24"/>
-          <w:szCs w:val="24"/>
-          <w:shd w:val="clear" w:color="auto" w:fill="FFFFFF"/>
-        </w:rPr>
-        <w:t>A</w:t>
-      </w:r>
-      <w:r>
-        <w:rPr>
-          <w:rFonts w:ascii="Times New Roman" w:hAnsi="Times New Roman" w:cs="Times New Roman"/>
-          <w:sz w:val="24"/>
-          <w:szCs w:val="24"/>
-          <w:shd w:val="clear" w:color="auto" w:fill="FFFFFF"/>
-        </w:rPr>
-        <w:t xml:space="preserve">I </w:t>
-      </w:r>
-      <w:r>
-        <w:rPr>
-          <w:rFonts w:ascii="Times New Roman" w:hAnsi="Times New Roman" w:cs="Times New Roman"/>
-          <w:sz w:val="24"/>
-          <w:szCs w:val="24"/>
-          <w:shd w:val="clear" w:color="auto" w:fill="FFFFFF"/>
-        </w:rPr>
-        <w:t>has</w:t>
-      </w:r>
-      <w:r>
-        <w:rPr>
-          <w:rFonts w:ascii="Times New Roman" w:hAnsi="Times New Roman" w:cs="Times New Roman"/>
-          <w:sz w:val="24"/>
-          <w:szCs w:val="24"/>
-          <w:shd w:val="clear" w:color="auto" w:fill="FFFFFF"/>
-        </w:rPr>
-        <w:t xml:space="preserve"> the potential to enhance aquaculture operations through the accurate prediction of water quality parameters, which is essential for maintaining optimal fish health and production </w:t>
-      </w:r>
-      <w:r>
-        <w:rPr>
-          <w:rFonts w:ascii="Times New Roman" w:hAnsi="Times New Roman" w:cs="Times New Roman"/>
-          <w:sz w:val="24"/>
-          <w:szCs w:val="24"/>
-          <w:shd w:val="clear" w:color="auto" w:fill="FFFFFF"/>
-        </w:rPr>
-        <w:t>conditions.</w:t>
-      </w:r>
-      <w:r>
-        <w:rPr>
-          <w:rFonts w:ascii="Times New Roman" w:hAnsi="Times New Roman" w:cs="Times New Roman"/>
-          <w:sz w:val="24"/>
-          <w:szCs w:val="24"/>
-          <w:shd w:val="clear" w:color="auto" w:fill="FFFFFF"/>
-        </w:rPr>
-        <w:t xml:space="preserve"> Prediction</w:t>
-      </w:r>
-      <w:r>
-        <w:rPr>
-          <w:rFonts w:ascii="Times New Roman" w:hAnsi="Times New Roman" w:cs="Times New Roman"/>
-          <w:sz w:val="24"/>
-          <w:szCs w:val="24"/>
-          <w:shd w:val="clear" w:color="auto" w:fill="FFFFFF"/>
-        </w:rPr>
-        <w:t xml:space="preserve"> methodologies currently employed are commonly divided into three main classes, including mathematical statistics-based models, machine learning models, and deep learning models</w:t>
-      </w:r>
-      <w:r>
-        <w:rPr>
-          <w:rFonts w:ascii="Times New Roman" w:hAnsi="Times New Roman" w:cs="Times New Roman"/>
-          <w:sz w:val="24"/>
-          <w:szCs w:val="24"/>
-          <w:shd w:val="clear" w:color="auto" w:fill="FFFFFF"/>
-        </w:rPr>
-        <w:t xml:space="preserve"> </w:t>
-      </w:r>
-      <w:r>
-        <w:rPr>
-          <w:rFonts w:ascii="Times New Roman" w:hAnsi="Times New Roman" w:cs="Times New Roman"/>
-          <w:sz w:val="24"/>
-          <w:szCs w:val="24"/>
-          <w:shd w:val="clear" w:color="auto" w:fill="FFFFFF"/>
-        </w:rPr>
-        <w:fldChar w:fldCharType="begin"/>
-      </w:r>
-      <w:r>
-        <w:rPr>
-          <w:rFonts w:ascii="Times New Roman" w:hAnsi="Times New Roman" w:cs="Times New Roman"/>
-          <w:sz w:val="24"/>
-          <w:szCs w:val="24"/>
-          <w:shd w:val="clear" w:color="auto" w:fill="FFFFFF"/>
-        </w:rPr>
-        <w:instrText xml:space="preserve"> ADDIN ZOTERO_ITEM CSL_CITATION {"citationID":"3whMoLi4","properties":{"unsorted":false,"formattedCitation":"(Li et al., 2025)","plainCitation":"(Li et al., 2025)","noteIndex":0},"citationItems":[{"id":732,"uris":["http://zotero.org/users/8571048/items/8U43C5QX"],"itemData":{"id":732,"type":"article-journal","abstract":"The accurate prediction of water quality parameters is crucial for the sustainable development of the aquaculture industry. Dissolved oxygen (DO) is an important indicator of water quality. Its fluctuations directly affect the living conditions of aquatic organisms and significantly affect the stability of aquaculture systems. However, accurate predictions still encounter challenges owing to the nonstationary nature of DO data, the complexity of trend changes, and the dynamics of local features. Therefore, this study proposed a DO time-series prediction model based on Transformer. Firstly, an adaptive sequence decomposition method is proposed to overcome the limitations of using a single raw sequence as input and to more effectively extract different feature patterns across multiple temporal scales. Secondly, a multi-resolution causal attention mechanism is designed to enhance temporal feature representation and improve the capture of local patterns, thereby strengthening the model’s ability to model causal relationships at different scales. Lastly, to address the challenge that traditional decomposition-based methods rely heavily on attention mechanisms for trend prediction and often fail to model trends effectively, we propose a trend perception module to improve the extraction of key trend information and detailed features. The experiments are based on six marine ranch datasets collected from diverse geographic and climatic regions, including Australia, the United States, and China. These datasets span from 2013 to 2022, covering a variety of typical scenarios such as natural waters, intensive aquaculture zones, and complex coastal bays. Using the Baffle Creek dataset as an example, the proposed model achieves an average reduction of 24.72% in MAE, 19.68% in RMSE, and 24.93% in MAPE, while improving R2 by 38.04% compared to other advanced models. These results demonstrate that the proposed model offers superior prediction accuracy and generalization capability, providing reliable support for the sustainable management of aquaculture systems.","container-title":"Applied Soft Computing","DOI":"10.1016/j.asoc.2025.113548","ISSN":"1568-4946","journalAbbreviation":"Applied Soft Computing","page":"113548","source":"ScienceDirect","title":"A Long-term precise prediction model for water quality in aquaculture based on an adaptive decomposition Transformer","URL":"https://www.sciencedirect.com/science/article/pii/S1568494625008592","volume":"182","author":[{"family":"Li","given":"Dashe"},{"family":"Liu","given":"Lu"},{"family":"Ji","given":"Xiaodong"}],"accessed":{"date-parts":[["2026",5,28]]},"issued":{"date-parts":[["2025",10,1]]}}}],"schema":"https://github.com/citation-style-language/schema/raw/master/csl-citation.json"} </w:instrText>
-      </w:r>
-      <w:r>
-        <w:rPr>
-          <w:rFonts w:ascii="Times New Roman" w:hAnsi="Times New Roman" w:cs="Times New Roman"/>
-          <w:sz w:val="24"/>
-          <w:szCs w:val="24"/>
-          <w:shd w:val="clear" w:color="auto" w:fill="FFFFFF"/>
-        </w:rPr>
-        <w:fldChar w:fldCharType="separate"/>
-      </w:r>
-      <w:r>
-        <w:rPr>
-          <w:rFonts w:ascii="Times New Roman" w:hAnsi="Times New Roman" w:cs="Times New Roman"/>
-          <w:sz w:val="24"/>
-        </w:rPr>
-        <w:t xml:space="preserve">(Li </w:t>
-      </w:r>
-      <w:r>
-        <w:rPr>
-          <w:rFonts w:ascii="Times New Roman" w:hAnsi="Times New Roman" w:cs="Times New Roman"/>
-          <w:i/>
-          <w:iCs/>
-          <w:sz w:val="24"/>
-        </w:rPr>
-        <w:t>et al.,</w:t>
-      </w:r>
-      <w:r>
-        <w:rPr>
-          <w:rFonts w:ascii="Times New Roman" w:hAnsi="Times New Roman" w:cs="Times New Roman"/>
-          <w:sz w:val="24"/>
-        </w:rPr>
-        <w:t xml:space="preserve"> 2025)</w:t>
-      </w:r>
-      <w:r>
-        <w:rPr>
-          <w:rFonts w:ascii="Times New Roman" w:hAnsi="Times New Roman" w:cs="Times New Roman"/>
-          <w:sz w:val="24"/>
-          <w:szCs w:val="24"/>
-          <w:shd w:val="clear" w:color="auto" w:fill="FFFFFF"/>
-        </w:rPr>
-        <w:fldChar w:fldCharType="end"/>
-      </w:r>
-      <w:r>
-        <w:rPr>
-          <w:rFonts w:ascii="Times New Roman" w:hAnsi="Times New Roman" w:cs="Times New Roman"/>
-          <w:sz w:val="24"/>
-          <w:szCs w:val="24"/>
-          <w:shd w:val="clear" w:color="auto" w:fill="FFFFFF"/>
-        </w:rPr>
-        <w:t>.</w:t>
-      </w:r>
-      <w:r>
-        <w:rPr>
-          <w:rFonts w:ascii="Times New Roman" w:hAnsi="Times New Roman" w:cs="Times New Roman"/>
-          <w:sz w:val="24"/>
-          <w:szCs w:val="24"/>
-          <w:shd w:val="clear" w:color="auto" w:fill="FFFFFF"/>
-        </w:rPr>
-        <w:t xml:space="preserve"> </w:t>
-      </w:r>
-    </w:p>
-    <w:p>
-      <w:pPr>
-        <w:spacing w:after="0" w:line="480" w:lineRule="auto"/>
-        <w:rPr>
-          <w:rFonts w:ascii="Times New Roman" w:hAnsi="Times New Roman" w:cs="Times New Roman"/>
-          <w:sz w:val="24"/>
-          <w:szCs w:val="24"/>
-          <w:shd w:val="clear" w:color="auto" w:fill="FFFFFF"/>
-        </w:rPr>
-      </w:pPr>
-      <w:r>
-        <w:rPr>
-          <w:rFonts w:ascii="Times New Roman" w:hAnsi="Times New Roman" w:cs="Times New Roman"/>
-          <w:sz w:val="24"/>
-          <w:szCs w:val="24"/>
-          <w:shd w:val="clear" w:color="auto" w:fill="FFFFFF"/>
-        </w:rPr>
-        <w:t>Mathematical-statistical prediction models utili</w:t>
-      </w:r>
-      <w:r>
-        <w:rPr>
-          <w:rFonts w:ascii="Times New Roman" w:hAnsi="Times New Roman" w:cs="Times New Roman"/>
-          <w:sz w:val="24"/>
-          <w:szCs w:val="24"/>
-          <w:shd w:val="clear" w:color="auto" w:fill="FFFFFF"/>
-        </w:rPr>
-        <w:t>s</w:t>
-      </w:r>
-      <w:r>
-        <w:rPr>
-          <w:rFonts w:ascii="Times New Roman" w:hAnsi="Times New Roman" w:cs="Times New Roman"/>
-          <w:sz w:val="24"/>
-          <w:szCs w:val="24"/>
-          <w:shd w:val="clear" w:color="auto" w:fill="FFFFFF"/>
-        </w:rPr>
-        <w:t xml:space="preserve">e established linear and nonlinear analytical approaches, with commonly used methods including the autoregressive moving average (ARMA) </w:t>
-      </w:r>
-      <w:r>
-        <w:rPr>
-          <w:rFonts w:ascii="Times New Roman" w:hAnsi="Times New Roman" w:cs="Times New Roman"/>
-          <w:sz w:val="24"/>
-          <w:szCs w:val="24"/>
-          <w:shd w:val="clear" w:color="auto" w:fill="FFFFFF"/>
-        </w:rPr>
-        <w:fldChar w:fldCharType="begin"/>
-      </w:r>
-      <w:r>
-        <w:rPr>
-          <w:rFonts w:ascii="Times New Roman" w:hAnsi="Times New Roman" w:cs="Times New Roman"/>
-          <w:sz w:val="24"/>
-          <w:szCs w:val="24"/>
-          <w:shd w:val="clear" w:color="auto" w:fill="FFFFFF"/>
-        </w:rPr>
-        <w:instrText xml:space="preserve"> ADDIN ZOTERO_ITEM CSL_CITATION {"citationID":"wFK4uTYl","properties":{"unsorted":false,"formattedCitation":"(Bichescu &amp; Polak, 2023)","plainCitation":"(Bichescu &amp; Polak, 2023)","noteIndex":0},"citationItems":[{"id":734,"uris":["http://zotero.org/users/8571048/items/A4Q68W68"],"itemData":{"id":734,"type":"article-journal","abstract":"We present an innovative approach to time-series analysis motivated by a desire to automate autoregressive integrated moving average (ARIMA) modeling and by extension, the process of building a reliable forecast. Our approach relies on optimization modeling and the decomposition of a time series into fixed seasonal effects, autoregressive (AR) terms, moving average (MA) terms, white noise, and any free variation outside of the selected model’s framework. The simultaneous selection of appropriately-lagged terms and estimation of their coefficients is achieved via mathematical programming to minimize normed errors subject to constraints that include a limit on the number of combined AR and MA terms to achieve desired parsimony. An estimator for white noise serves as a stationary reference signal for determining the MA coefficients and is modeled using wavelets, which facilitate the formulation of integer linear constraints. We report the results of numerical testing of this methodology on several real-world datasets and discuss the main implications for research and practice. We find that our models (i) achieve one step-ahead forecasting accuracy that outperforms other, widely-used interpretable methodologies, including random forests and gradient boosting models, (ii) offer interpretable results, and (iii) are computationally tractable.","container-title":"Computers &amp; Operations Research","DOI":"10.1016/j.cor.2022.106079","ISSN":"0305-0548","journalAbbreviation":"Computers &amp; Operations Research","page":"106079","source":"ScienceDirect","title":"Time series modeling and forecasting by mathematical programming","URL":"https://www.sciencedirect.com/science/article/pii/S0305054822003094","volume":"151","author":[{"family":"Bichescu","given":"Bogdan"},{"family":"Polak","given":"George G."}],"accessed":{"date-parts":[["2026",5,28]]},"issued":{"date-parts":[["2023",3,1]]}}}],"schema":"https://github.com/citation-style-language/schema/raw/master/csl-citation.json"} </w:instrText>
-      </w:r>
-      <w:r>
-        <w:rPr>
-          <w:rFonts w:ascii="Times New Roman" w:hAnsi="Times New Roman" w:cs="Times New Roman"/>
-          <w:sz w:val="24"/>
-          <w:szCs w:val="24"/>
-          <w:shd w:val="clear" w:color="auto" w:fill="FFFFFF"/>
-        </w:rPr>
-        <w:fldChar w:fldCharType="separate"/>
-      </w:r>
-      <w:r>
-        <w:rPr>
-          <w:rFonts w:ascii="Times New Roman" w:hAnsi="Times New Roman" w:cs="Times New Roman"/>
-          <w:sz w:val="24"/>
-        </w:rPr>
-        <w:t>(Bichescu &amp; Polak, 2023)</w:t>
-      </w:r>
-      <w:r>
-        <w:rPr>
-          <w:rFonts w:ascii="Times New Roman" w:hAnsi="Times New Roman" w:cs="Times New Roman"/>
-          <w:sz w:val="24"/>
-          <w:szCs w:val="24"/>
-          <w:shd w:val="clear" w:color="auto" w:fill="FFFFFF"/>
-        </w:rPr>
-        <w:fldChar w:fldCharType="end"/>
-      </w:r>
-      <w:r>
-        <w:rPr>
-          <w:rFonts w:ascii="Times New Roman" w:hAnsi="Times New Roman" w:cs="Times New Roman"/>
-          <w:sz w:val="24"/>
-          <w:szCs w:val="24"/>
-          <w:shd w:val="clear" w:color="auto" w:fill="FFFFFF"/>
-        </w:rPr>
-        <w:t xml:space="preserve"> </w:t>
-      </w:r>
-      <w:r>
-        <w:rPr>
-          <w:rFonts w:ascii="Times New Roman" w:hAnsi="Times New Roman" w:cs="Times New Roman"/>
-          <w:sz w:val="24"/>
-          <w:szCs w:val="24"/>
-          <w:shd w:val="clear" w:color="auto" w:fill="FFFFFF"/>
-        </w:rPr>
-        <w:t>and seasonal autoregressive integrated moving average (SARIMA) models</w:t>
-      </w:r>
-      <w:r>
-        <w:rPr>
-          <w:rFonts w:ascii="Times New Roman" w:hAnsi="Times New Roman" w:cs="Times New Roman"/>
-          <w:sz w:val="24"/>
-          <w:szCs w:val="24"/>
-          <w:shd w:val="clear" w:color="auto" w:fill="FFFFFF"/>
-        </w:rPr>
-        <w:t xml:space="preserve"> </w:t>
-      </w:r>
-      <w:r>
-        <w:rPr>
-          <w:rFonts w:ascii="Times New Roman" w:hAnsi="Times New Roman" w:cs="Times New Roman"/>
-          <w:sz w:val="24"/>
-          <w:szCs w:val="24"/>
-          <w:shd w:val="clear" w:color="auto" w:fill="FFFFFF"/>
-        </w:rPr>
-        <w:fldChar w:fldCharType="begin"/>
-      </w:r>
-      <w:r>
-        <w:rPr>
-          <w:rFonts w:ascii="Times New Roman" w:hAnsi="Times New Roman" w:cs="Times New Roman"/>
-          <w:sz w:val="24"/>
-          <w:szCs w:val="24"/>
-          <w:shd w:val="clear" w:color="auto" w:fill="FFFFFF"/>
-        </w:rPr>
-        <w:instrText xml:space="preserve"> ADDIN ZOTERO_ITEM CSL_CITATION {"citationID":"3jOTEgpy","properties":{"unsorted":false,"formattedCitation":"(ArunKumar et al., 2021)","plainCitation":"(ArunKumar et al., 2021)","noteIndex":0},"citationItems":[{"id":736,"uris":["http://zotero.org/users/8571048/items/LCXYB35S"],"itemData":{"id":736,"type":"article-journal","abstract":"Most countries are reopening or considering lifting the stringent prevention policies such as lockdowns, consequently, daily coronavirus disease (COVID-19) cases (confirmed, recovered and deaths) are increasing significantly. As of July 25th, there are 16.5 million global cumulative confirmed cases, 9.4 million cumulative recovered cases and 0.65 million deaths. There is a tremendous necessity of supervising and estimating future COVID-19 cases to control the spread and help countries prepare their healthcare systems. In this study, time-series models — Auto-Regressive Integrated Moving Average (ARIMA) and Seasonal Auto-Regressive Integrated Moving Average (SARIMA) are used to forecast the epidemiological trends of the COVID-19 pandemic for top-16 countries where 70%–80% of global cumulative cases are located. Initial combinations of the model parameters were selected using the auto-ARIMA model followed by finding the optimized model parameters based on the best fit between the predictions and test data. Analytical tools Auto-Correlation function (ACF), Partial Auto-Correlation Function (PACF), Akaike Information Criterion (AIC) and Bayesian Information Criterion (BIC) were used to assess the reliability of the models. Evaluation metrics Mean Absolute Error (MAE), Mean Square Error (MSE), Root Mean Square Error (RMSE) and Mean Absolute Percent Error (MAPE) were used as criteria for selecting the best model. A case study was presented where the statistical methodology was discussed in detail for model selection and the procedure for forecasting the COVID-19 cases of the USA. Best model parameters of ARIMA and SARIMA for each country are selected manually and the optimized parameters are then used to forecast the COVID-19 cases. Forecasted trends for confirmed and recovered cases showed an exponential rise for countries such as the United States, Brazil, South Africa, Colombia, Bangladesh, India, Mexico and Pakistan. Similarly, trends for cumulative deaths showed an exponential rise for countries Brazil, South Africa, Chile, Colombia, Bangladesh, India, Mexico, Iran, Peru, and Russia. SARIMA model predictions are more realistic than that of the ARIMA model predictions confirming the existence of seasonality in COVID-19 data. The results of this study not only shed light on the future trends of the COVID-19 outbreak in top-16 countries but also guide these countries to prepare their health care policies for the ongoing pandemic. The data used in this work is obtained from publicly available John Hopkins University’s COVID-19 database.","container-title":"Applied Soft Computing","DOI":"10.1016/j.asoc.2021.107161","ISSN":"1568-4946","journalAbbreviation":"Applied Soft Computing","page":"107161","source":"ScienceDirect","title":"Forecasting the dynamics of cumulative COVID-19 cases (confirmed, recovered and deaths) for top-16 countries using statistical machine learning models: Auto-Regressive Integrated Moving Average (ARIMA) and Seasonal Auto-Regressive Integrated Moving Average (SARIMA)","title-short":"Forecasting the dynamics of cumulative COVID-19 cases (confirmed, recovered and deaths) for top-16 countries using statistical machine learning models","URL":"https://www.sciencedirect.com/science/article/pii/S1568494621000843","volume":"103","author":[{"family":"ArunKumar","given":"K. E."},{"family":"Kalaga","given":"Dinesh V."},{"family":"Sai Kumar","given":"Ch. Mohan"},{"family":"Chilkoor","given":"Govinda"},{"family":"Kawaji","given":"Masahiro"},{"family":"Brenza","given":"Timothy M."}],"accessed":{"date-parts":[["2026",5,28]]},"issued":{"date-parts":[["2021",5,1]]}}}],"schema":"https://github.com/citation-style-language/schema/raw/master/csl-citation.json"} </w:instrText>
-      </w:r>
-      <w:r>
-        <w:rPr>
-          <w:rFonts w:ascii="Times New Roman" w:hAnsi="Times New Roman" w:cs="Times New Roman"/>
-          <w:sz w:val="24"/>
-          <w:szCs w:val="24"/>
-          <w:shd w:val="clear" w:color="auto" w:fill="FFFFFF"/>
-        </w:rPr>
-        <w:fldChar w:fldCharType="separate"/>
-      </w:r>
-      <w:r>
-        <w:rPr>
-          <w:rFonts w:ascii="Times New Roman" w:hAnsi="Times New Roman" w:cs="Times New Roman"/>
-          <w:i/>
-          <w:iCs/>
-          <w:sz w:val="24"/>
-        </w:rPr>
-        <w:t>(</w:t>
-      </w:r>
-      <w:r>
-        <w:rPr>
-          <w:rFonts w:ascii="Times New Roman" w:hAnsi="Times New Roman" w:cs="Times New Roman"/>
-          <w:sz w:val="24"/>
-        </w:rPr>
-        <w:t>ArunKumar</w:t>
-      </w:r>
-      <w:r>
-        <w:rPr>
-          <w:rFonts w:ascii="Times New Roman" w:hAnsi="Times New Roman" w:cs="Times New Roman"/>
-          <w:i/>
-          <w:iCs/>
-          <w:sz w:val="24"/>
-        </w:rPr>
-        <w:t xml:space="preserve"> et al.,</w:t>
-      </w:r>
-      <w:r>
-        <w:rPr>
-          <w:rFonts w:ascii="Times New Roman" w:hAnsi="Times New Roman" w:cs="Times New Roman"/>
-          <w:sz w:val="24"/>
-        </w:rPr>
-        <w:t xml:space="preserve"> 2021)</w:t>
-      </w:r>
-      <w:r>
-        <w:rPr>
-          <w:rFonts w:ascii="Times New Roman" w:hAnsi="Times New Roman" w:cs="Times New Roman"/>
-          <w:sz w:val="24"/>
-          <w:szCs w:val="24"/>
-          <w:shd w:val="clear" w:color="auto" w:fill="FFFFFF"/>
-        </w:rPr>
-        <w:fldChar w:fldCharType="end"/>
-      </w:r>
-      <w:r>
-        <w:rPr>
-          <w:rFonts w:ascii="Times New Roman" w:hAnsi="Times New Roman" w:cs="Times New Roman"/>
-          <w:sz w:val="24"/>
-          <w:szCs w:val="24"/>
-          <w:shd w:val="clear" w:color="auto" w:fill="FFFFFF"/>
-        </w:rPr>
-        <w:t>.</w:t>
-      </w:r>
-      <w:r>
-        <w:rPr>
-          <w:rFonts w:ascii="Times New Roman" w:hAnsi="Times New Roman" w:cs="Times New Roman"/>
-          <w:sz w:val="24"/>
-          <w:szCs w:val="24"/>
-          <w:shd w:val="clear" w:color="auto" w:fill="FFFFFF"/>
-        </w:rPr>
-        <w:t xml:space="preserve"> </w:t>
-      </w:r>
-    </w:p>
-    <w:p>
-      <w:pPr>
-        <w:spacing w:after="0" w:line="480" w:lineRule="auto"/>
-        <w:rPr>
-          <w:rFonts w:ascii="Times New Roman" w:hAnsi="Times New Roman" w:cs="Times New Roman"/>
-          <w:sz w:val="24"/>
-          <w:szCs w:val="24"/>
-          <w:shd w:val="clear" w:color="auto" w:fill="FFFFFF"/>
-        </w:rPr>
-      </w:pPr>
-      <w:r>
-        <w:rPr>
-          <w:rFonts w:ascii="Times New Roman" w:hAnsi="Times New Roman" w:cs="Times New Roman"/>
-          <w:sz w:val="24"/>
-          <w:szCs w:val="24"/>
-          <w:shd w:val="clear" w:color="auto" w:fill="FFFFFF"/>
-        </w:rPr>
-        <w:t xml:space="preserve">Advances in sensor technology and data-driven </w:t>
-      </w:r>
-      <w:r>
-        <w:rPr>
-          <w:rFonts w:ascii="Times New Roman" w:hAnsi="Times New Roman" w:cs="Times New Roman"/>
-          <w:sz w:val="24"/>
-          <w:szCs w:val="24"/>
-          <w:shd w:val="clear" w:color="auto" w:fill="FFFFFF"/>
-        </w:rPr>
-        <w:t>modelling</w:t>
-      </w:r>
-      <w:r>
-        <w:rPr>
-          <w:rFonts w:ascii="Times New Roman" w:hAnsi="Times New Roman" w:cs="Times New Roman"/>
-          <w:sz w:val="24"/>
-          <w:szCs w:val="24"/>
-          <w:shd w:val="clear" w:color="auto" w:fill="FFFFFF"/>
-        </w:rPr>
-        <w:t xml:space="preserve"> techniques have substantially improved the capacity to monitor and predict dissolved oxygen (DO) levels, thereby facilitating proactive management and decision-making in aquaculture systems</w:t>
-      </w:r>
-      <w:r>
-        <w:rPr>
-          <w:rFonts w:ascii="Times New Roman" w:hAnsi="Times New Roman" w:cs="Times New Roman"/>
-          <w:sz w:val="24"/>
-          <w:szCs w:val="24"/>
-          <w:shd w:val="clear" w:color="auto" w:fill="FFFFFF"/>
-        </w:rPr>
-        <w:t xml:space="preserve"> </w:t>
-      </w:r>
-      <w:r>
-        <w:rPr>
-          <w:rFonts w:ascii="Times New Roman" w:hAnsi="Times New Roman" w:cs="Times New Roman"/>
-          <w:sz w:val="24"/>
-          <w:szCs w:val="24"/>
-          <w:shd w:val="clear" w:color="auto" w:fill="FFFFFF"/>
-        </w:rPr>
-        <w:fldChar w:fldCharType="begin"/>
-      </w:r>
-      <w:r>
-        <w:rPr>
-          <w:rFonts w:ascii="Times New Roman" w:hAnsi="Times New Roman" w:cs="Times New Roman"/>
-          <w:sz w:val="24"/>
-          <w:szCs w:val="24"/>
-          <w:shd w:val="clear" w:color="auto" w:fill="FFFFFF"/>
-        </w:rPr>
-        <w:instrText xml:space="preserve"> ADDIN ZOTERO_ITEM CSL_CITATION {"citationID":"mAi5zFxj","properties":{"unsorted":false,"formattedCitation":"(Yu et al., 2026)","plainCitation":"(Yu et al., 2026)","noteIndex":0},"citationItems":[{"id":745,"uris":["http://zotero.org/users/8571048/items/5WGT9TII"],"itemData":{"id":745,"type":"article-journal","abstract":"In pond aquaculture, maintaining stable Dissolved Oxygen (DO) concentrations is essential for preventing hypoxia, optimizing growth conditions, and ensuring sustainable operations. Therefore, DO prediction is a crucial aspect of intelligent aquaculture systems, directly influencing water quality, aquatic health, and overall productivity. Advances in sensor technology and data-driven modeling have significantly enhanced the ability to monitor and forecast DO levels, enabling proactive management strategies. This review presents a novel taxonomy for classifying DO prediction approaches in pond aquaculture, structured into three key areas: (1) Driven Factors of DO, examining environmental, biological, and operational influences on DO dynamics; (2) Predictive Models, methods ranging from statistical approaches to advanced deep learning, highlighting promising techniques such as physics-informed neural networks (PINNs) and transfer learning for data-scarce environments; and (3) Monitoring and Sensor Technologies, covering electrochemical and optical sensors, particularly fluorescence-based systems, integrated with Internet of Things (IoT) platforms for real-time assessment. By synthesizing these domains, the review identifies opportunities to enhance DO prediction accuracy and monitoring reliability, supporting intelligent aeration control, improved resource efficiency, and more resilient aquaculture operations.","container-title":"Aquacultural Engineering","DOI":"10.1016/j.aquaeng.2025.102634","ISSN":"0144-8609","journalAbbreviation":"Aquacultural Engineering","page":"102634","source":"ScienceDirect","title":"Dissolved oxygen in aquaculture ponds: Causal factors, predictive modeling, and intelligent monitoring","title-short":"Dissolved oxygen in aquaculture ponds","URL":"https://www.sciencedirect.com/science/article/pii/S0144860925001232","volume":"112","author":[{"family":"Yu","given":"Minghao"},{"family":"Feng","given":"Yingqi"},{"family":"Ouyang","given":"Bing"},{"family":"Wills","given":"Paul S."},{"family":"Tang","given":"Yufei"}],"accessed":{"date-parts":[["2026",5,31]]},"issued":{"date-parts":[["2026",1,15]]}}}],"schema":"https://github.com/citation-style-language/schema/raw/master/csl-citation.json"} </w:instrText>
-      </w:r>
-      <w:r>
-        <w:rPr>
-          <w:rFonts w:ascii="Times New Roman" w:hAnsi="Times New Roman" w:cs="Times New Roman"/>
-          <w:sz w:val="24"/>
-          <w:szCs w:val="24"/>
-          <w:shd w:val="clear" w:color="auto" w:fill="FFFFFF"/>
-        </w:rPr>
-        <w:fldChar w:fldCharType="separate"/>
-      </w:r>
-      <w:r>
-        <w:rPr>
-          <w:rFonts w:ascii="Times New Roman" w:hAnsi="Times New Roman" w:cs="Times New Roman"/>
-          <w:sz w:val="24"/>
-        </w:rPr>
-        <w:t xml:space="preserve">(Yu </w:t>
-      </w:r>
-      <w:r>
-        <w:rPr>
-          <w:rFonts w:ascii="Times New Roman" w:hAnsi="Times New Roman" w:cs="Times New Roman"/>
-          <w:i/>
-          <w:iCs/>
-          <w:sz w:val="24"/>
-        </w:rPr>
-        <w:t>et al.,</w:t>
-      </w:r>
-      <w:r>
-        <w:rPr>
-          <w:rFonts w:ascii="Times New Roman" w:hAnsi="Times New Roman" w:cs="Times New Roman"/>
-          <w:sz w:val="24"/>
-        </w:rPr>
-        <w:t xml:space="preserve"> 2026)</w:t>
-      </w:r>
-      <w:r>
-        <w:rPr>
-          <w:rFonts w:ascii="Times New Roman" w:hAnsi="Times New Roman" w:cs="Times New Roman"/>
-          <w:sz w:val="24"/>
-          <w:szCs w:val="24"/>
-          <w:shd w:val="clear" w:color="auto" w:fill="FFFFFF"/>
-        </w:rPr>
-        <w:fldChar w:fldCharType="end"/>
-      </w:r>
-      <w:r>
-        <w:rPr>
-          <w:rFonts w:ascii="Times New Roman" w:hAnsi="Times New Roman" w:cs="Times New Roman"/>
-          <w:sz w:val="24"/>
-          <w:szCs w:val="24"/>
-          <w:shd w:val="clear" w:color="auto" w:fill="FFFFFF"/>
-        </w:rPr>
-        <w:t>.</w:t>
-      </w:r>
-    </w:p>
-    <w:p>
-      <w:pPr>
-        <w:spacing w:after="0" w:line="480" w:lineRule="auto"/>
+        <w:t>AI</w:t>
+      </w:r>
+      <w:r>
         <w:rPr>
           <w:rFonts w:ascii="Times New Roman" w:hAnsi="Times New Roman" w:cs="Times New Roman"/>
           <w:b/>
@@ -3282,7 +2769,8 @@
           <w:szCs w:val="24"/>
           <w:shd w:val="clear" w:color="auto" w:fill="FFFFFF"/>
         </w:rPr>
-      </w:pPr>
+        <w:t>)</w:t>
+      </w:r>
       <w:r>
         <w:rPr>
           <w:rFonts w:ascii="Times New Roman" w:hAnsi="Times New Roman" w:cs="Times New Roman"/>
@@ -3292,9 +2780,463 @@
           <w:szCs w:val="24"/>
           <w:shd w:val="clear" w:color="auto" w:fill="FFFFFF"/>
         </w:rPr>
-        <w:t xml:space="preserve">Catla (Indian carp) and </w:t>
-      </w:r>
-      <w:r>
+        <w:t xml:space="preserve"> Methods </w:t>
+      </w:r>
+    </w:p>
+    <w:p>
+      <w:pPr>
+        <w:spacing w:after="0" w:line="480" w:lineRule="auto"/>
+        <w:rPr>
+          <w:rFonts w:ascii="Times New Roman" w:hAnsi="Times New Roman" w:cs="Times New Roman"/>
+          <w:sz w:val="24"/>
+          <w:szCs w:val="24"/>
+          <w:shd w:val="clear" w:color="auto" w:fill="FFFFFF"/>
+        </w:rPr>
+      </w:pPr>
+      <w:r>
+        <w:rPr>
+          <w:rFonts w:ascii="Times New Roman" w:hAnsi="Times New Roman" w:cs="Times New Roman"/>
+          <w:sz w:val="24"/>
+          <w:szCs w:val="24"/>
+          <w:shd w:val="clear" w:color="auto" w:fill="FFFFFF"/>
+        </w:rPr>
+        <w:t>A</w:t>
+      </w:r>
+      <w:r>
+        <w:rPr>
+          <w:rFonts w:ascii="Times New Roman" w:hAnsi="Times New Roman" w:cs="Times New Roman"/>
+          <w:sz w:val="24"/>
+          <w:szCs w:val="24"/>
+          <w:shd w:val="clear" w:color="auto" w:fill="FFFFFF"/>
+        </w:rPr>
+        <w:t xml:space="preserve">I </w:t>
+      </w:r>
+      <w:r>
+        <w:rPr>
+          <w:rFonts w:ascii="Times New Roman" w:hAnsi="Times New Roman" w:cs="Times New Roman"/>
+          <w:sz w:val="24"/>
+          <w:szCs w:val="24"/>
+          <w:shd w:val="clear" w:color="auto" w:fill="FFFFFF"/>
+        </w:rPr>
+        <w:t>has</w:t>
+      </w:r>
+      <w:r>
+        <w:rPr>
+          <w:rFonts w:ascii="Times New Roman" w:hAnsi="Times New Roman" w:cs="Times New Roman"/>
+          <w:sz w:val="24"/>
+          <w:szCs w:val="24"/>
+          <w:shd w:val="clear" w:color="auto" w:fill="FFFFFF"/>
+        </w:rPr>
+        <w:t xml:space="preserve"> the potential to enhance aquaculture operations through the accurate prediction of water quality parameters, which is essential for maintaining optimal fish health and production </w:t>
+      </w:r>
+      <w:r>
+        <w:rPr>
+          <w:rFonts w:ascii="Times New Roman" w:hAnsi="Times New Roman" w:cs="Times New Roman"/>
+          <w:sz w:val="24"/>
+          <w:szCs w:val="24"/>
+          <w:shd w:val="clear" w:color="auto" w:fill="FFFFFF"/>
+        </w:rPr>
+        <w:t>conditions.</w:t>
+      </w:r>
+      <w:r>
+        <w:rPr>
+          <w:rFonts w:ascii="Times New Roman" w:hAnsi="Times New Roman" w:cs="Times New Roman"/>
+          <w:sz w:val="24"/>
+          <w:szCs w:val="24"/>
+          <w:shd w:val="clear" w:color="auto" w:fill="FFFFFF"/>
+        </w:rPr>
+        <w:t xml:space="preserve"> Prediction</w:t>
+      </w:r>
+      <w:r>
+        <w:rPr>
+          <w:rFonts w:ascii="Times New Roman" w:hAnsi="Times New Roman" w:cs="Times New Roman"/>
+          <w:sz w:val="24"/>
+          <w:szCs w:val="24"/>
+          <w:shd w:val="clear" w:color="auto" w:fill="FFFFFF"/>
+        </w:rPr>
+        <w:t xml:space="preserve"> methodologies currently employed are commonly divided into three main classes, including mathematical statistics-based models, machine learning models, and deep learning models</w:t>
+      </w:r>
+      <w:r>
+        <w:rPr>
+          <w:rFonts w:ascii="Times New Roman" w:hAnsi="Times New Roman" w:cs="Times New Roman"/>
+          <w:sz w:val="24"/>
+          <w:szCs w:val="24"/>
+          <w:shd w:val="clear" w:color="auto" w:fill="FFFFFF"/>
+        </w:rPr>
+        <w:t xml:space="preserve"> </w:t>
+      </w:r>
+      <w:r>
+        <w:rPr>
+          <w:rFonts w:ascii="Times New Roman" w:hAnsi="Times New Roman" w:cs="Times New Roman"/>
+          <w:sz w:val="24"/>
+          <w:szCs w:val="24"/>
+          <w:shd w:val="clear" w:color="auto" w:fill="FFFFFF"/>
+        </w:rPr>
+        <w:fldChar w:fldCharType="begin"/>
+      </w:r>
+      <w:r>
+        <w:rPr>
+          <w:rFonts w:ascii="Times New Roman" w:hAnsi="Times New Roman" w:cs="Times New Roman"/>
+          <w:sz w:val="24"/>
+          <w:szCs w:val="24"/>
+          <w:shd w:val="clear" w:color="auto" w:fill="FFFFFF"/>
+        </w:rPr>
+        <w:instrText xml:space="preserve"> ADDIN ZOTERO_ITEM CSL_CITATION {"citationID":"3whMoLi4","properties":{"unsorted":false,"formattedCitation":"(Li et al., 2025)","plainCitation":"(Li et al., 2025)","noteIndex":0},"citationItems":[{"id":732,"uris":["http://zotero.org/users/8571048/items/8U43C5QX"],"itemData":{"id":732,"type":"article-journal","abstract":"The accurate prediction of water quality parameters is crucial for the sustainable development of the aquaculture industry. Dissolved oxygen (DO) is an important indicator of water quality. Its fluctuations directly affect the living conditions of aquatic organisms and significantly affect the stability of aquaculture systems. However, accurate predictions still encounter challenges owing to the nonstationary nature of DO data, the complexity of trend changes, and the dynamics of local features. Therefore, this study proposed a DO time-series prediction model based on Transformer. Firstly, an adaptive sequence decomposition method is proposed to overcome the limitations of using a single raw sequence as input and to more effectively extract different feature patterns across multiple temporal scales. Secondly, a multi-resolution causal attention mechanism is designed to enhance temporal feature representation and improve the capture of local patterns, thereby strengthening the model’s ability to model causal relationships at different scales. Lastly, to address the challenge that traditional decomposition-based methods rely heavily on attention mechanisms for trend prediction and often fail to model trends effectively, we propose a trend perception module to improve the extraction of key trend information and detailed features. The experiments are based on six marine ranch datasets collected from diverse geographic and climatic regions, including Australia, the United States, and China. These datasets span from 2013 to 2022, covering a variety of typical scenarios such as natural waters, intensive aquaculture zones, and complex coastal bays. Using the Baffle Creek dataset as an example, the proposed model achieves an average reduction of 24.72% in MAE, 19.68% in RMSE, and 24.93% in MAPE, while improving R2 by 38.04% compared to other advanced models. These results demonstrate that the proposed model offers superior prediction accuracy and generalization capability, providing reliable support for the sustainable management of aquaculture systems.","container-title":"Applied Soft Computing","DOI":"10.1016/j.asoc.2025.113548","ISSN":"1568-4946","journalAbbreviation":"Applied Soft Computing","page":"113548","source":"ScienceDirect","title":"A Long-term precise prediction model for water quality in aquaculture based on an adaptive decomposition Transformer","URL":"https://www.sciencedirect.com/science/article/pii/S1568494625008592","volume":"182","author":[{"family":"Li","given":"Dashe"},{"family":"Liu","given":"Lu"},{"family":"Ji","given":"Xiaodong"}],"accessed":{"date-parts":[["2026",5,28]]},"issued":{"date-parts":[["2025",10,1]]}}}],"schema":"https://github.com/citation-style-language/schema/raw/master/csl-citation.json"} </w:instrText>
+      </w:r>
+      <w:r>
+        <w:rPr>
+          <w:rFonts w:ascii="Times New Roman" w:hAnsi="Times New Roman" w:cs="Times New Roman"/>
+          <w:sz w:val="24"/>
+          <w:szCs w:val="24"/>
+          <w:shd w:val="clear" w:color="auto" w:fill="FFFFFF"/>
+        </w:rPr>
+        <w:fldChar w:fldCharType="separate"/>
+      </w:r>
+      <w:r>
+        <w:rPr>
+          <w:rFonts w:ascii="Times New Roman" w:hAnsi="Times New Roman" w:cs="Times New Roman"/>
+          <w:sz w:val="24"/>
+        </w:rPr>
+        <w:t xml:space="preserve">(Li </w:t>
+      </w:r>
+      <w:r>
+        <w:rPr>
+          <w:rFonts w:ascii="Times New Roman" w:hAnsi="Times New Roman" w:cs="Times New Roman"/>
+          <w:i/>
+          <w:iCs/>
+          <w:sz w:val="24"/>
+        </w:rPr>
+        <w:t>et al.,</w:t>
+      </w:r>
+      <w:r>
+        <w:rPr>
+          <w:rFonts w:ascii="Times New Roman" w:hAnsi="Times New Roman" w:cs="Times New Roman"/>
+          <w:sz w:val="24"/>
+        </w:rPr>
+        <w:t xml:space="preserve"> 2025)</w:t>
+      </w:r>
+      <w:r>
+        <w:rPr>
+          <w:rFonts w:ascii="Times New Roman" w:hAnsi="Times New Roman" w:cs="Times New Roman"/>
+          <w:sz w:val="24"/>
+          <w:szCs w:val="24"/>
+          <w:shd w:val="clear" w:color="auto" w:fill="FFFFFF"/>
+        </w:rPr>
+        <w:fldChar w:fldCharType="end"/>
+      </w:r>
+      <w:r>
+        <w:rPr>
+          <w:rFonts w:ascii="Times New Roman" w:hAnsi="Times New Roman" w:cs="Times New Roman"/>
+          <w:sz w:val="24"/>
+          <w:szCs w:val="24"/>
+          <w:shd w:val="clear" w:color="auto" w:fill="FFFFFF"/>
+        </w:rPr>
+        <w:t>.</w:t>
+      </w:r>
+      <w:r>
+        <w:rPr>
+          <w:rFonts w:ascii="Times New Roman" w:hAnsi="Times New Roman" w:cs="Times New Roman"/>
+          <w:sz w:val="24"/>
+          <w:szCs w:val="24"/>
+          <w:shd w:val="clear" w:color="auto" w:fill="FFFFFF"/>
+        </w:rPr>
+        <w:t xml:space="preserve"> </w:t>
+      </w:r>
+    </w:p>
+    <w:p>
+      <w:pPr>
+        <w:spacing w:after="0" w:line="480" w:lineRule="auto"/>
+        <w:rPr>
+          <w:rFonts w:ascii="Times New Roman" w:hAnsi="Times New Roman" w:cs="Times New Roman"/>
+          <w:sz w:val="24"/>
+          <w:szCs w:val="24"/>
+          <w:shd w:val="clear" w:color="auto" w:fill="FFFFFF"/>
+        </w:rPr>
+      </w:pPr>
+      <w:r>
+        <w:rPr>
+          <w:rFonts w:ascii="Times New Roman" w:hAnsi="Times New Roman" w:cs="Times New Roman"/>
+          <w:sz w:val="24"/>
+          <w:szCs w:val="24"/>
+          <w:shd w:val="clear" w:color="auto" w:fill="FFFFFF"/>
+        </w:rPr>
+        <w:t>Mathematical-statistical prediction models utili</w:t>
+      </w:r>
+      <w:r>
+        <w:rPr>
+          <w:rFonts w:ascii="Times New Roman" w:hAnsi="Times New Roman" w:cs="Times New Roman"/>
+          <w:sz w:val="24"/>
+          <w:szCs w:val="24"/>
+          <w:shd w:val="clear" w:color="auto" w:fill="FFFFFF"/>
+        </w:rPr>
+        <w:t>s</w:t>
+      </w:r>
+      <w:r>
+        <w:rPr>
+          <w:rFonts w:ascii="Times New Roman" w:hAnsi="Times New Roman" w:cs="Times New Roman"/>
+          <w:sz w:val="24"/>
+          <w:szCs w:val="24"/>
+          <w:shd w:val="clear" w:color="auto" w:fill="FFFFFF"/>
+        </w:rPr>
+        <w:t xml:space="preserve">e established linear and nonlinear analytical approaches, with commonly used methods including the autoregressive moving average (ARMA) </w:t>
+      </w:r>
+      <w:r>
+        <w:rPr>
+          <w:rFonts w:ascii="Times New Roman" w:hAnsi="Times New Roman" w:cs="Times New Roman"/>
+          <w:sz w:val="24"/>
+          <w:szCs w:val="24"/>
+          <w:shd w:val="clear" w:color="auto" w:fill="FFFFFF"/>
+        </w:rPr>
+        <w:fldChar w:fldCharType="begin"/>
+      </w:r>
+      <w:r>
+        <w:rPr>
+          <w:rFonts w:ascii="Times New Roman" w:hAnsi="Times New Roman" w:cs="Times New Roman"/>
+          <w:sz w:val="24"/>
+          <w:szCs w:val="24"/>
+          <w:shd w:val="clear" w:color="auto" w:fill="FFFFFF"/>
+        </w:rPr>
+        <w:instrText xml:space="preserve"> ADDIN ZOTERO_ITEM CSL_CITATION {"citationID":"wFK4uTYl","properties":{"unsorted":false,"formattedCitation":"(Bichescu &amp; Polak, 2023)","plainCitation":"(Bichescu &amp; Polak, 2023)","noteIndex":0},"citationItems":[{"id":734,"uris":["http://zotero.org/users/8571048/items/A4Q68W68"],"itemData":{"id":734,"type":"article-journal","abstract":"We present an innovative approach to time-series analysis motivated by a desire to automate autoregressive integrated moving average (ARIMA) modeling and by extension, the process of building a reliable forecast. Our approach relies on optimization modeling and the decomposition of a time series into fixed seasonal effects, autoregressive (AR) terms, moving average (MA) terms, white noise, and any free variation outside of the selected model’s framework. The simultaneous selection of appropriately-lagged terms and estimation of their coefficients is achieved via mathematical programming to minimize normed errors subject to constraints that include a limit on the number of combined AR and MA terms to achieve desired parsimony. An estimator for white noise serves as a stationary reference signal for determining the MA coefficients and is modeled using wavelets, which facilitate the formulation of integer linear constraints. We report the results of numerical testing of this methodology on several real-world datasets and discuss the main implications for research and practice. We find that our models (i) achieve one step-ahead forecasting accuracy that outperforms other, widely-used interpretable methodologies, including random forests and gradient boosting models, (ii) offer interpretable results, and (iii) are computationally tractable.","container-title":"Computers &amp; Operations Research","DOI":"10.1016/j.cor.2022.106079","ISSN":"0305-0548","journalAbbreviation":"Computers &amp; Operations Research","page":"106079","source":"ScienceDirect","title":"Time series modeling and forecasting by mathematical programming","URL":"https://www.sciencedirect.com/science/article/pii/S0305054822003094","volume":"151","author":[{"family":"Bichescu","given":"Bogdan"},{"family":"Polak","given":"George G."}],"accessed":{"date-parts":[["2026",5,28]]},"issued":{"date-parts":[["2023",3,1]]}}}],"schema":"https://github.com/citation-style-language/schema/raw/master/csl-citation.json"} </w:instrText>
+      </w:r>
+      <w:r>
+        <w:rPr>
+          <w:rFonts w:ascii="Times New Roman" w:hAnsi="Times New Roman" w:cs="Times New Roman"/>
+          <w:sz w:val="24"/>
+          <w:szCs w:val="24"/>
+          <w:shd w:val="clear" w:color="auto" w:fill="FFFFFF"/>
+        </w:rPr>
+        <w:fldChar w:fldCharType="separate"/>
+      </w:r>
+      <w:r>
+        <w:rPr>
+          <w:rFonts w:ascii="Times New Roman" w:hAnsi="Times New Roman" w:cs="Times New Roman"/>
+          <w:sz w:val="24"/>
+        </w:rPr>
+        <w:t>(Bichescu &amp; Polak, 2023)</w:t>
+      </w:r>
+      <w:r>
+        <w:rPr>
+          <w:rFonts w:ascii="Times New Roman" w:hAnsi="Times New Roman" w:cs="Times New Roman"/>
+          <w:sz w:val="24"/>
+          <w:szCs w:val="24"/>
+          <w:shd w:val="clear" w:color="auto" w:fill="FFFFFF"/>
+        </w:rPr>
+        <w:fldChar w:fldCharType="end"/>
+      </w:r>
+      <w:r>
+        <w:rPr>
+          <w:rFonts w:ascii="Times New Roman" w:hAnsi="Times New Roman" w:cs="Times New Roman"/>
+          <w:sz w:val="24"/>
+          <w:szCs w:val="24"/>
+          <w:shd w:val="clear" w:color="auto" w:fill="FFFFFF"/>
+        </w:rPr>
+        <w:t xml:space="preserve"> </w:t>
+      </w:r>
+      <w:r>
+        <w:rPr>
+          <w:rFonts w:ascii="Times New Roman" w:hAnsi="Times New Roman" w:cs="Times New Roman"/>
+          <w:sz w:val="24"/>
+          <w:szCs w:val="24"/>
+          <w:shd w:val="clear" w:color="auto" w:fill="FFFFFF"/>
+        </w:rPr>
+        <w:t>and seasonal autoregressive integrated moving average (SARIMA) models</w:t>
+      </w:r>
+      <w:r>
+        <w:rPr>
+          <w:rFonts w:ascii="Times New Roman" w:hAnsi="Times New Roman" w:cs="Times New Roman"/>
+          <w:sz w:val="24"/>
+          <w:szCs w:val="24"/>
+          <w:shd w:val="clear" w:color="auto" w:fill="FFFFFF"/>
+        </w:rPr>
+        <w:t xml:space="preserve"> </w:t>
+      </w:r>
+      <w:r>
+        <w:rPr>
+          <w:rFonts w:ascii="Times New Roman" w:hAnsi="Times New Roman" w:cs="Times New Roman"/>
+          <w:sz w:val="24"/>
+          <w:szCs w:val="24"/>
+          <w:shd w:val="clear" w:color="auto" w:fill="FFFFFF"/>
+        </w:rPr>
+        <w:fldChar w:fldCharType="begin"/>
+      </w:r>
+      <w:r>
+        <w:rPr>
+          <w:rFonts w:ascii="Times New Roman" w:hAnsi="Times New Roman" w:cs="Times New Roman"/>
+          <w:sz w:val="24"/>
+          <w:szCs w:val="24"/>
+          <w:shd w:val="clear" w:color="auto" w:fill="FFFFFF"/>
+        </w:rPr>
+        <w:instrText xml:space="preserve"> ADDIN ZOTERO_ITEM CSL_CITATION {"citationID":"3jOTEgpy","properties":{"unsorted":false,"formattedCitation":"(ArunKumar et al., 2021)","plainCitation":"(ArunKumar et al., 2021)","noteIndex":0},"citationItems":[{"id":736,"uris":["http://zotero.org/users/8571048/items/LCXYB35S"],"itemData":{"id":736,"type":"article-journal","abstract":"Most countries are reopening or considering lifting the stringent prevention policies such as lockdowns, consequently, daily coronavirus disease (COVID-19) cases (confirmed, recovered and deaths) are increasing significantly. As of July 25th, there are 16.5 million global cumulative confirmed cases, 9.4 million cumulative recovered cases and 0.65 million deaths. There is a tremendous necessity of supervising and estimating future COVID-19 cases to control the spread and help countries prepare their healthcare systems. In this study, time-series models — Auto-Regressive Integrated Moving Average (ARIMA) and Seasonal Auto-Regressive Integrated Moving Average (SARIMA) are used to forecast the epidemiological trends of the COVID-19 pandemic for top-16 countries where 70%–80% of global cumulative cases are located. Initial combinations of the model parameters were selected using the auto-ARIMA model followed by finding the optimized model parameters based on the best fit between the predictions and test data. Analytical tools Auto-Correlation function (ACF), Partial Auto-Correlation Function (PACF), Akaike Information Criterion (AIC) and Bayesian Information Criterion (BIC) were used to assess the reliability of the models. Evaluation metrics Mean Absolute Error (MAE), Mean Square Error (MSE), Root Mean Square Error (RMSE) and Mean Absolute Percent Error (MAPE) were used as criteria for selecting the best model. A case study was presented where the statistical methodology was discussed in detail for model selection and the procedure for forecasting the COVID-19 cases of the USA. Best model parameters of ARIMA and SARIMA for each country are selected manually and the optimized parameters are then used to forecast the COVID-19 cases. Forecasted trends for confirmed and recovered cases showed an exponential rise for countries such as the United States, Brazil, South Africa, Colombia, Bangladesh, India, Mexico and Pakistan. Similarly, trends for cumulative deaths showed an exponential rise for countries Brazil, South Africa, Chile, Colombia, Bangladesh, India, Mexico, Iran, Peru, and Russia. SARIMA model predictions are more realistic than that of the ARIMA model predictions confirming the existence of seasonality in COVID-19 data. The results of this study not only shed light on the future trends of the COVID-19 outbreak in top-16 countries but also guide these countries to prepare their health care policies for the ongoing pandemic. The data used in this work is obtained from publicly available John Hopkins University’s COVID-19 database.","container-title":"Applied Soft Computing","DOI":"10.1016/j.asoc.2021.107161","ISSN":"1568-4946","journalAbbreviation":"Applied Soft Computing","page":"107161","source":"ScienceDirect","title":"Forecasting the dynamics of cumulative COVID-19 cases (confirmed, recovered and deaths) for top-16 countries using statistical machine learning models: Auto-Regressive Integrated Moving Average (ARIMA) and Seasonal Auto-Regressive Integrated Moving Average (SARIMA)","title-short":"Forecasting the dynamics of cumulative COVID-19 cases (confirmed, recovered and deaths) for top-16 countries using statistical machine learning models","URL":"https://www.sciencedirect.com/science/article/pii/S1568494621000843","volume":"103","author":[{"family":"ArunKumar","given":"K. E."},{"family":"Kalaga","given":"Dinesh V."},{"family":"Sai Kumar","given":"Ch. Mohan"},{"family":"Chilkoor","given":"Govinda"},{"family":"Kawaji","given":"Masahiro"},{"family":"Brenza","given":"Timothy M."}],"accessed":{"date-parts":[["2026",5,28]]},"issued":{"date-parts":[["2021",5,1]]}}}],"schema":"https://github.com/citation-style-language/schema/raw/master/csl-citation.json"} </w:instrText>
+      </w:r>
+      <w:r>
+        <w:rPr>
+          <w:rFonts w:ascii="Times New Roman" w:hAnsi="Times New Roman" w:cs="Times New Roman"/>
+          <w:sz w:val="24"/>
+          <w:szCs w:val="24"/>
+          <w:shd w:val="clear" w:color="auto" w:fill="FFFFFF"/>
+        </w:rPr>
+        <w:fldChar w:fldCharType="separate"/>
+      </w:r>
+      <w:r>
+        <w:rPr>
+          <w:rFonts w:ascii="Times New Roman" w:hAnsi="Times New Roman" w:cs="Times New Roman"/>
+          <w:i/>
+          <w:iCs/>
+          <w:sz w:val="24"/>
+        </w:rPr>
+        <w:t>(</w:t>
+      </w:r>
+      <w:r>
+        <w:rPr>
+          <w:rFonts w:ascii="Times New Roman" w:hAnsi="Times New Roman" w:cs="Times New Roman"/>
+          <w:sz w:val="24"/>
+        </w:rPr>
+        <w:t>ArunKumar</w:t>
+      </w:r>
+      <w:r>
+        <w:rPr>
+          <w:rFonts w:ascii="Times New Roman" w:hAnsi="Times New Roman" w:cs="Times New Roman"/>
+          <w:i/>
+          <w:iCs/>
+          <w:sz w:val="24"/>
+        </w:rPr>
+        <w:t xml:space="preserve"> et al.,</w:t>
+      </w:r>
+      <w:r>
+        <w:rPr>
+          <w:rFonts w:ascii="Times New Roman" w:hAnsi="Times New Roman" w:cs="Times New Roman"/>
+          <w:sz w:val="24"/>
+        </w:rPr>
+        <w:t xml:space="preserve"> 2021)</w:t>
+      </w:r>
+      <w:r>
+        <w:rPr>
+          <w:rFonts w:ascii="Times New Roman" w:hAnsi="Times New Roman" w:cs="Times New Roman"/>
+          <w:sz w:val="24"/>
+          <w:szCs w:val="24"/>
+          <w:shd w:val="clear" w:color="auto" w:fill="FFFFFF"/>
+        </w:rPr>
+        <w:fldChar w:fldCharType="end"/>
+      </w:r>
+      <w:r>
+        <w:rPr>
+          <w:rFonts w:ascii="Times New Roman" w:hAnsi="Times New Roman" w:cs="Times New Roman"/>
+          <w:sz w:val="24"/>
+          <w:szCs w:val="24"/>
+          <w:shd w:val="clear" w:color="auto" w:fill="FFFFFF"/>
+        </w:rPr>
+        <w:t>.</w:t>
+      </w:r>
+      <w:r>
+        <w:rPr>
+          <w:rFonts w:ascii="Times New Roman" w:hAnsi="Times New Roman" w:cs="Times New Roman"/>
+          <w:sz w:val="24"/>
+          <w:szCs w:val="24"/>
+          <w:shd w:val="clear" w:color="auto" w:fill="FFFFFF"/>
+        </w:rPr>
+        <w:t xml:space="preserve"> </w:t>
+      </w:r>
+    </w:p>
+    <w:p>
+      <w:pPr>
+        <w:spacing w:after="0" w:line="480" w:lineRule="auto"/>
+        <w:rPr>
+          <w:rFonts w:ascii="Times New Roman" w:hAnsi="Times New Roman" w:cs="Times New Roman"/>
+          <w:sz w:val="24"/>
+          <w:szCs w:val="24"/>
+          <w:shd w:val="clear" w:color="auto" w:fill="FFFFFF"/>
+        </w:rPr>
+      </w:pPr>
+      <w:r>
+        <w:rPr>
+          <w:rFonts w:ascii="Times New Roman" w:hAnsi="Times New Roman" w:cs="Times New Roman"/>
+          <w:sz w:val="24"/>
+          <w:szCs w:val="24"/>
+          <w:shd w:val="clear" w:color="auto" w:fill="FFFFFF"/>
+        </w:rPr>
+        <w:t>Advances in sensor technology and data-driven modelling techniques have substantially improved the capacity to monitor and predict dissolved oxygen (DO) levels, thereby facilitating proactive management and decision-making in aquaculture systems</w:t>
+      </w:r>
+      <w:r>
+        <w:rPr>
+          <w:rFonts w:ascii="Times New Roman" w:hAnsi="Times New Roman" w:cs="Times New Roman"/>
+          <w:sz w:val="24"/>
+          <w:szCs w:val="24"/>
+          <w:shd w:val="clear" w:color="auto" w:fill="FFFFFF"/>
+        </w:rPr>
+        <w:t xml:space="preserve"> </w:t>
+      </w:r>
+      <w:r>
+        <w:rPr>
+          <w:rFonts w:ascii="Times New Roman" w:hAnsi="Times New Roman" w:cs="Times New Roman"/>
+          <w:sz w:val="24"/>
+          <w:szCs w:val="24"/>
+          <w:shd w:val="clear" w:color="auto" w:fill="FFFFFF"/>
+        </w:rPr>
+        <w:fldChar w:fldCharType="begin"/>
+      </w:r>
+      <w:r>
+        <w:rPr>
+          <w:rFonts w:ascii="Times New Roman" w:hAnsi="Times New Roman" w:cs="Times New Roman"/>
+          <w:sz w:val="24"/>
+          <w:szCs w:val="24"/>
+          <w:shd w:val="clear" w:color="auto" w:fill="FFFFFF"/>
+        </w:rPr>
+        <w:instrText xml:space="preserve"> ADDIN ZOTERO_ITEM CSL_CITATION {"citationID":"mAi5zFxj","properties":{"unsorted":false,"formattedCitation":"(Yu et al., 2026)","plainCitation":"(Yu et al., 2026)","noteIndex":0},"citationItems":[{"id":745,"uris":["http://zotero.org/users/8571048/items/5WGT9TII"],"itemData":{"id":745,"type":"article-journal","abstract":"In pond aquaculture, maintaining stable Dissolved Oxygen (DO) concentrations is essential for preventing hypoxia, optimizing growth conditions, and ensuring sustainable operations. Therefore, DO prediction is a crucial aspect of intelligent aquaculture systems, directly influencing water quality, aquatic health, and overall productivity. Advances in sensor technology and data-driven modeling have significantly enhanced the ability to monitor and forecast DO levels, enabling proactive management strategies. This review presents a novel taxonomy for classifying DO prediction approaches in pond aquaculture, structured into three key areas: (1) Driven Factors of DO, examining environmental, biological, and operational influences on DO dynamics; (2) Predictive Models, methods ranging from statistical approaches to advanced deep learning, highlighting promising techniques such as physics-informed neural networks (PINNs) and transfer learning for data-scarce environments; and (3) Monitoring and Sensor Technologies, covering electrochemical and optical sensors, particularly fluorescence-based systems, integrated with Internet of Things (IoT) platforms for real-time assessment. By synthesizing these domains, the review identifies opportunities to enhance DO prediction accuracy and monitoring reliability, supporting intelligent aeration control, improved resource efficiency, and more resilient aquaculture operations.","container-title":"Aquacultural Engineering","DOI":"10.1016/j.aquaeng.2025.102634","ISSN":"0144-8609","journalAbbreviation":"Aquacultural Engineering","page":"102634","source":"ScienceDirect","title":"Dissolved oxygen in aquaculture ponds: Causal factors, predictive modeling, and intelligent monitoring","title-short":"Dissolved oxygen in aquaculture ponds","URL":"https://www.sciencedirect.com/science/article/pii/S0144860925001232","volume":"112","author":[{"family":"Yu","given":"Minghao"},{"family":"Feng","given":"Yingqi"},{"family":"Ouyang","given":"Bing"},{"family":"Wills","given":"Paul S."},{"family":"Tang","given":"Yufei"}],"accessed":{"date-parts":[["2026",5,31]]},"issued":{"date-parts":[["2026",1,15]]}}}],"schema":"https://github.com/citation-style-language/schema/raw/master/csl-citation.json"} </w:instrText>
+      </w:r>
+      <w:r>
+        <w:rPr>
+          <w:rFonts w:ascii="Times New Roman" w:hAnsi="Times New Roman" w:cs="Times New Roman"/>
+          <w:sz w:val="24"/>
+          <w:szCs w:val="24"/>
+          <w:shd w:val="clear" w:color="auto" w:fill="FFFFFF"/>
+        </w:rPr>
+        <w:fldChar w:fldCharType="separate"/>
+      </w:r>
+      <w:r>
+        <w:rPr>
+          <w:rFonts w:ascii="Times New Roman" w:hAnsi="Times New Roman" w:cs="Times New Roman"/>
+          <w:sz w:val="24"/>
+        </w:rPr>
+        <w:t xml:space="preserve">(Yu </w:t>
+      </w:r>
+      <w:r>
+        <w:rPr>
+          <w:rFonts w:ascii="Times New Roman" w:hAnsi="Times New Roman" w:cs="Times New Roman"/>
+          <w:i/>
+          <w:iCs/>
+          <w:sz w:val="24"/>
+        </w:rPr>
+        <w:t>et al.,</w:t>
+      </w:r>
+      <w:r>
+        <w:rPr>
+          <w:rFonts w:ascii="Times New Roman" w:hAnsi="Times New Roman" w:cs="Times New Roman"/>
+          <w:sz w:val="24"/>
+        </w:rPr>
+        <w:t xml:space="preserve"> 2026)</w:t>
+      </w:r>
+      <w:r>
+        <w:rPr>
+          <w:rFonts w:ascii="Times New Roman" w:hAnsi="Times New Roman" w:cs="Times New Roman"/>
+          <w:sz w:val="24"/>
+          <w:szCs w:val="24"/>
+          <w:shd w:val="clear" w:color="auto" w:fill="FFFFFF"/>
+        </w:rPr>
+        <w:fldChar w:fldCharType="end"/>
+      </w:r>
+      <w:r>
+        <w:rPr>
+          <w:rFonts w:ascii="Times New Roman" w:hAnsi="Times New Roman" w:cs="Times New Roman"/>
+          <w:sz w:val="24"/>
+          <w:szCs w:val="24"/>
+          <w:shd w:val="clear" w:color="auto" w:fill="FFFFFF"/>
+        </w:rPr>
+        <w:t>.</w:t>
+      </w:r>
+    </w:p>
+    <w:p>
+      <w:pPr>
+        <w:spacing w:after="0" w:line="480" w:lineRule="auto"/>
         <w:rPr>
           <w:rFonts w:ascii="Times New Roman" w:hAnsi="Times New Roman" w:cs="Times New Roman"/>
           <w:b/>
@@ -3303,8 +3245,7 @@
           <w:szCs w:val="24"/>
           <w:shd w:val="clear" w:color="auto" w:fill="FFFFFF"/>
         </w:rPr>
-        <w:t>Tilapia</w:t>
-      </w:r>
+      </w:pPr>
       <w:r>
         <w:rPr>
           <w:rFonts w:ascii="Times New Roman" w:hAnsi="Times New Roman" w:cs="Times New Roman"/>
@@ -3314,6 +3255,28 @@
           <w:szCs w:val="24"/>
           <w:shd w:val="clear" w:color="auto" w:fill="FFFFFF"/>
         </w:rPr>
+        <w:t xml:space="preserve">Catla (Indian carp) and </w:t>
+      </w:r>
+      <w:r>
+        <w:rPr>
+          <w:rFonts w:ascii="Times New Roman" w:hAnsi="Times New Roman" w:cs="Times New Roman"/>
+          <w:b/>
+          <w:bCs/>
+          <w:sz w:val="24"/>
+          <w:szCs w:val="24"/>
+          <w:shd w:val="clear" w:color="auto" w:fill="FFFFFF"/>
+        </w:rPr>
+        <w:t>Tilapia</w:t>
+      </w:r>
+      <w:r>
+        <w:rPr>
+          <w:rFonts w:ascii="Times New Roman" w:hAnsi="Times New Roman" w:cs="Times New Roman"/>
+          <w:b/>
+          <w:bCs/>
+          <w:sz w:val="24"/>
+          <w:szCs w:val="24"/>
+          <w:shd w:val="clear" w:color="auto" w:fill="FFFFFF"/>
+        </w:rPr>
         <w:t xml:space="preserve"> Fish</w:t>
       </w:r>
     </w:p>
@@ -3485,6 +3448,15 @@
         </w:rPr>
         <w:fldChar w:fldCharType="end"/>
       </w:r>
+      <w:r>
+        <w:rPr>
+          <w:rFonts w:ascii="Times New Roman" w:hAnsi="Times New Roman" w:cs="Times New Roman"/>
+          <w:sz w:val="24"/>
+          <w:szCs w:val="24"/>
+          <w:shd w:val="clear" w:color="auto" w:fill="FFFFFF"/>
+        </w:rPr>
+        <w:t>.</w:t>
+      </w:r>
     </w:p>
     <w:p>
       <w:pPr>
@@ -3527,7 +3499,6 @@
           <w:szCs w:val="24"/>
           <w:shd w:val="clear" w:color="auto" w:fill="FFFFFF"/>
         </w:rPr>
-        <w:lastRenderedPageBreak/>
         <w:t>References</w:t>
       </w:r>
     </w:p>
@@ -6826,6 +6797,7 @@
   <w:style w:type="character" w:default="1" w:styleId="DefaultParagraphFont">
     <w:name w:val="Default Paragraph Font"/>
     <w:uiPriority w:val="1"/>
+    <w:semiHidden/>
     <w:unhideWhenUsed/>
   </w:style>
   <w:style w:type="table" w:default="1" w:styleId="TableNormal">

</xml_diff>